<commit_message>
fix: updated a01 a06 fichas
</commit_message>
<xml_diff>
--- a/outputs/a01/a01_ficha_funcional.docx
+++ b/outputs/a01/a01_ficha_funcional.docx
@@ -1,8 +1,8 @@
 
 <file path=word/document.xml><?xml version="1.0" encoding="utf-8"?>
-<w:document xmlns:w="http://schemas.openxmlformats.org/wordprocessingml/2006/main" xmlns:ns1="http://schemas.openxmlformats.org/markup-compatibility/2006" xmlns:ns2="http://schemas.microsoft.com/office/word/2010/wordml" xmlns:ns3="http://schemas.openxmlformats.org/drawingml/2006/wordprocessingDrawing" xmlns:ns4="http://schemas.microsoft.com/office/word/2010/wordprocessingDrawing" xmlns:ns5="http://schemas.openxmlformats.org/drawingml/2006/main" xmlns:ns6="http://schemas.openxmlformats.org/drawingml/2006/picture" xmlns:ns7="http://schemas.openxmlformats.org/officeDocument/2006/relationships" xmlns:w15="http://schemas.microsoft.com/office/word/2012/wordml" xmlns:w16="http://schemas.microsoft.com/office/word/2018/wordml" xmlns:w16cex="http://schemas.microsoft.com/office/word/2018/wordml/cex" xmlns:w16cid="http://schemas.microsoft.com/office/word/2016/wordml/cid" xmlns:w16du="http://schemas.microsoft.com/office/word/2023/wordml/word16du" xmlns:w16se="http://schemas.microsoft.com/office/word/2015/wordml/symex" xmlns:w16sdtfl="http://schemas.microsoft.com/office/word/2020/wordml/sdtdatahash" xmlns:w16sdtdh="http://schemas.microsoft.com/office/word/2020/wordml/sdtdatahash" xmlns:w14="http://schemas.microsoft.com/office/word/2010/wordml" xmlns:wp14="http://schemas.microsoft.com/office/word/2010/wordprocessingDrawing" ns1:Ignorable="w14 w15 w16se w16cid w16 w16cex w16sdtdh w16sdtfl w16du wp14">
+<w:document xmlns:wpc="http://schemas.microsoft.com/office/word/2010/wordprocessingCanvas" xmlns:cx="http://schemas.microsoft.com/office/drawing/2014/chartex" xmlns:cx1="http://schemas.microsoft.com/office/drawing/2015/9/8/chartex" xmlns:cx2="http://schemas.microsoft.com/office/drawing/2015/10/21/chartex" xmlns:cx3="http://schemas.microsoft.com/office/drawing/2016/5/9/chartex" xmlns:cx4="http://schemas.microsoft.com/office/drawing/2016/5/10/chartex" xmlns:cx5="http://schemas.microsoft.com/office/drawing/2016/5/11/chartex" xmlns:cx6="http://schemas.microsoft.com/office/drawing/2016/5/12/chartex" xmlns:cx7="http://schemas.microsoft.com/office/drawing/2016/5/13/chartex" xmlns:cx8="http://schemas.microsoft.com/office/drawing/2016/5/14/chartex" xmlns:mc="http://schemas.openxmlformats.org/markup-compatibility/2006" xmlns:aink="http://schemas.microsoft.com/office/drawing/2016/ink" xmlns:am3d="http://schemas.microsoft.com/office/drawing/2017/model3d" xmlns:o="urn:schemas-microsoft-com:office:office" xmlns:oel="http://schemas.microsoft.com/office/2019/extlst" xmlns:r="http://schemas.openxmlformats.org/officeDocument/2006/relationships" xmlns:m="http://schemas.openxmlformats.org/officeDocument/2006/math" xmlns:v="urn:schemas-microsoft-com:vml" xmlns:wp14="http://schemas.microsoft.com/office/word/2010/wordprocessingDrawing" xmlns:wp="http://schemas.openxmlformats.org/drawingml/2006/wordprocessingDrawing" xmlns:w10="urn:schemas-microsoft-com:office:word" xmlns:w="http://schemas.openxmlformats.org/wordprocessingml/2006/main" xmlns:w14="http://schemas.microsoft.com/office/word/2010/wordml" xmlns:w15="http://schemas.microsoft.com/office/word/2012/wordml" xmlns:w16cex="http://schemas.microsoft.com/office/word/2018/wordml/cex" xmlns:w16cid="http://schemas.microsoft.com/office/word/2016/wordml/cid" xmlns:w16="http://schemas.microsoft.com/office/word/2018/wordml" xmlns:w16du="http://schemas.microsoft.com/office/word/2023/wordml/word16du" xmlns:w16sdtdh="http://schemas.microsoft.com/office/word/2020/wordml/sdtdatahash" xmlns:w16sdtfl="http://schemas.microsoft.com/office/word/2024/wordml/sdtformatlock" xmlns:w16se="http://schemas.microsoft.com/office/word/2015/wordml/symex" xmlns:wpg="http://schemas.microsoft.com/office/word/2010/wordprocessingGroup" xmlns:wpi="http://schemas.microsoft.com/office/word/2010/wordprocessingInk" xmlns:wne="http://schemas.microsoft.com/office/word/2006/wordml" xmlns:wps="http://schemas.microsoft.com/office/word/2010/wordprocessingShape" mc:Ignorable="w14 w15 w16se w16cid w16 w16cex w16sdtdh w16sdtfl w16du wp14">
   <w:body>
-    <w:p ns2:paraId="106243A3" ns2:textId="77777777">
+    <w:p>
       <w:pPr>
         <w:widowControl w:val="0"/>
         <w:pBdr>
@@ -15,120 +15,120 @@
         <w:spacing w:after="0" w:line="276" w:lineRule="auto"/>
       </w:pPr>
     </w:p>
-    <w:p ns2:paraId="24C99032" ns2:textId="77777777">
+    <w:p>
       <w:r>
         <w:rPr>
           <w:noProof/>
         </w:rPr>
         <w:drawing>
-          <ns3:anchor distT="0" distB="0" distL="114300" distR="114300" simplePos="0" relativeHeight="251658240" behindDoc="0" locked="0" layoutInCell="1" hidden="0" allowOverlap="1" ns4:anchorId="6DA82D87" ns4:editId="67E776CC">
-            <ns3:simplePos x="0" y="0"/>
-            <ns3:positionH relativeFrom="column">
-              <ns3:posOffset>590550</ns3:posOffset>
-            </ns3:positionH>
-            <ns3:positionV relativeFrom="paragraph">
-              <ns3:posOffset>0</ns3:posOffset>
-            </ns3:positionV>
-            <ns3:extent cx="3373120" cy="2032000"/>
-            <ns3:effectExtent l="0" t="0" r="0" b="0"/>
-            <ns3:wrapSquare wrapText="bothSides" distT="0" distB="0" distL="114300" distR="114300"/>
-            <ns3:docPr id="1001" name="image5.jpg" descr="A logo with green leaves  AI-generated content may be incorrect."/>
-            <ns3:cNvGraphicFramePr/>
-            <ns5:graphic>
-              <ns5:graphicData uri="http://schemas.openxmlformats.org/drawingml/2006/picture">
-                <ns6:pic>
-                  <ns6:nvPicPr>
-                    <ns6:cNvPr id="0" name="image5.jpg" descr="A logo with green leaves  AI-generated content may be incorrect."/>
-                    <ns6:cNvPicPr preferRelativeResize="0"/>
-                  </ns6:nvPicPr>
-                  <ns6:blipFill>
-                    <ns5:blip ns7:embed="rId9"/>
-                    <ns5:srcRect/>
-                    <ns5:stretch>
-                      <ns5:fillRect/>
-                    </ns5:stretch>
-                  </ns6:blipFill>
-                  <ns6:spPr>
-                    <ns5:xfrm>
-                      <ns5:off x="0" y="0"/>
-                      <ns5:ext cx="3373120" cy="2032000"/>
-                    </ns5:xfrm>
-                    <ns5:prstGeom prst="rect">
-                      <ns5:avLst/>
-                    </ns5:prstGeom>
-                    <ns5:ln/>
-                  </ns6:spPr>
-                </ns6:pic>
-              </ns5:graphicData>
-            </ns5:graphic>
-          </ns3:anchor>
+          <wp:anchor distT="0" distB="0" distL="114300" distR="114300" simplePos="0" relativeHeight="251658240" behindDoc="0" locked="0" layoutInCell="1" hidden="0" allowOverlap="1" wp14:anchorId="6DA82D87" wp14:editId="67E776CC">
+            <wp:simplePos x="0" y="0"/>
+            <wp:positionH relativeFrom="column">
+              <wp:posOffset>590550</wp:posOffset>
+            </wp:positionH>
+            <wp:positionV relativeFrom="paragraph">
+              <wp:posOffset>0</wp:posOffset>
+            </wp:positionV>
+            <wp:extent cx="3373120" cy="2032000"/>
+            <wp:effectExtent l="0" t="0" r="0" b="0"/>
+            <wp:wrapSquare wrapText="bothSides" distT="0" distB="0" distL="114300" distR="114300"/>
+            <wp:docPr id="1001" name="image5.jpg" descr="A logo with green leaves  AI-generated content may be incorrect."/>
+            <wp:cNvGraphicFramePr/>
+            <a:graphic xmlns:a="http://schemas.openxmlformats.org/drawingml/2006/main">
+              <a:graphicData uri="http://schemas.openxmlformats.org/drawingml/2006/picture">
+                <pic:pic xmlns:pic="http://schemas.openxmlformats.org/drawingml/2006/picture">
+                  <pic:nvPicPr>
+                    <pic:cNvPr id="0" name="image5.jpg" descr="A logo with green leaves  AI-generated content may be incorrect."/>
+                    <pic:cNvPicPr preferRelativeResize="0"/>
+                  </pic:nvPicPr>
+                  <pic:blipFill>
+                    <a:blip r:embed="rId9"/>
+                    <a:srcRect/>
+                    <a:stretch>
+                      <a:fillRect/>
+                    </a:stretch>
+                  </pic:blipFill>
+                  <pic:spPr>
+                    <a:xfrm>
+                      <a:off x="0" y="0"/>
+                      <a:ext cx="3373120" cy="2032000"/>
+                    </a:xfrm>
+                    <a:prstGeom prst="rect">
+                      <a:avLst/>
+                    </a:prstGeom>
+                    <a:ln/>
+                  </pic:spPr>
+                </pic:pic>
+              </a:graphicData>
+            </a:graphic>
+          </wp:anchor>
         </w:drawing>
       </w:r>
     </w:p>
-    <w:p ns2:paraId="63AD88AE" ns2:textId="77777777"/>
-    <w:p ns2:paraId="13617619" ns2:textId="77777777"/>
-    <w:p ns2:paraId="1CFC4C5D" ns2:textId="77777777">
+    <w:p/>
+    <w:p/>
+    <w:p>
       <w:r>
         <w:rPr>
           <w:noProof/>
         </w:rPr>
         <w:drawing>
-          <ns3:anchor distT="0" distB="0" distL="114300" distR="114300" simplePos="0" relativeHeight="251659264" behindDoc="0" locked="0" layoutInCell="1" hidden="0" allowOverlap="1" ns4:anchorId="35C55989" ns4:editId="6F08A60C">
-            <ns3:simplePos x="0" y="0"/>
-            <ns3:positionH relativeFrom="column">
-              <ns3:posOffset>2634615</ns3:posOffset>
-            </ns3:positionH>
-            <ns3:positionV relativeFrom="paragraph">
-              <ns3:posOffset>130810</ns3:posOffset>
-            </ns3:positionV>
-            <ns3:extent cx="2266950" cy="1295400"/>
-            <ns3:effectExtent l="0" t="0" r="0" b="0"/>
-            <ns3:wrapNone/>
-            <ns3:docPr id="1002" name="image1.png" descr="A black background with white text and brown lines  AI-generated content may be incorrect."/>
-            <ns3:cNvGraphicFramePr/>
-            <ns5:graphic>
-              <ns5:graphicData uri="http://schemas.openxmlformats.org/drawingml/2006/picture">
-                <ns6:pic>
-                  <ns6:nvPicPr>
-                    <ns6:cNvPr id="0" name="image1.png" descr="A black background with white text and brown lines  AI-generated content may be incorrect."/>
-                    <ns6:cNvPicPr preferRelativeResize="0"/>
-                  </ns6:nvPicPr>
-                  <ns6:blipFill>
-                    <ns5:blip ns7:embed="rId10"/>
-                    <ns5:srcRect/>
-                    <ns5:stretch>
-                      <ns5:fillRect/>
-                    </ns5:stretch>
-                  </ns6:blipFill>
-                  <ns6:spPr>
-                    <ns5:xfrm>
-                      <ns5:off x="0" y="0"/>
-                      <ns5:ext cx="2266950" cy="1295400"/>
-                    </ns5:xfrm>
-                    <ns5:prstGeom prst="rect">
-                      <ns5:avLst/>
-                    </ns5:prstGeom>
-                    <ns5:ln/>
-                  </ns6:spPr>
-                </ns6:pic>
-              </ns5:graphicData>
-            </ns5:graphic>
-          </ns3:anchor>
+          <wp:anchor distT="0" distB="0" distL="114300" distR="114300" simplePos="0" relativeHeight="251659264" behindDoc="0" locked="0" layoutInCell="1" hidden="0" allowOverlap="1" wp14:anchorId="35C55989" wp14:editId="6F08A60C">
+            <wp:simplePos x="0" y="0"/>
+            <wp:positionH relativeFrom="column">
+              <wp:posOffset>2634615</wp:posOffset>
+            </wp:positionH>
+            <wp:positionV relativeFrom="paragraph">
+              <wp:posOffset>130810</wp:posOffset>
+            </wp:positionV>
+            <wp:extent cx="2266950" cy="1295400"/>
+            <wp:effectExtent l="0" t="0" r="0" b="0"/>
+            <wp:wrapNone/>
+            <wp:docPr id="1002" name="image1.png" descr="A black background with white text and brown lines  AI-generated content may be incorrect."/>
+            <wp:cNvGraphicFramePr/>
+            <a:graphic xmlns:a="http://schemas.openxmlformats.org/drawingml/2006/main">
+              <a:graphicData uri="http://schemas.openxmlformats.org/drawingml/2006/picture">
+                <pic:pic xmlns:pic="http://schemas.openxmlformats.org/drawingml/2006/picture">
+                  <pic:nvPicPr>
+                    <pic:cNvPr id="0" name="image1.png" descr="A black background with white text and brown lines  AI-generated content may be incorrect."/>
+                    <pic:cNvPicPr preferRelativeResize="0"/>
+                  </pic:nvPicPr>
+                  <pic:blipFill>
+                    <a:blip r:embed="rId10"/>
+                    <a:srcRect/>
+                    <a:stretch>
+                      <a:fillRect/>
+                    </a:stretch>
+                  </pic:blipFill>
+                  <pic:spPr>
+                    <a:xfrm>
+                      <a:off x="0" y="0"/>
+                      <a:ext cx="2266950" cy="1295400"/>
+                    </a:xfrm>
+                    <a:prstGeom prst="rect">
+                      <a:avLst/>
+                    </a:prstGeom>
+                    <a:ln/>
+                  </pic:spPr>
+                </pic:pic>
+              </a:graphicData>
+            </a:graphic>
+          </wp:anchor>
         </w:drawing>
       </w:r>
     </w:p>
-    <w:p ns2:paraId="160A56DE" ns2:textId="77777777"/>
-    <w:p ns2:paraId="25B33647" ns2:textId="77777777"/>
-    <w:p ns2:paraId="6735FB09" ns2:textId="77777777"/>
-    <w:p ns2:paraId="1CEC7FC8" ns2:textId="77777777"/>
-    <w:p ns2:paraId="37EEEAA2" ns2:textId="77777777">
+    <w:p/>
+    <w:p/>
+    <w:p/>
+    <w:p/>
+    <w:p>
       <w:pPr>
         <w:jc w:val="right"/>
       </w:pPr>
     </w:p>
-    <w:p ns2:paraId="63AC0D8F" ns2:textId="77777777"/>
-    <w:p ns2:paraId="5A911671" ns2:textId="77777777"/>
-    <w:p ns2:paraId="0B16D1AF" ns2:textId="77777777">
+    <w:p/>
+    <w:p/>
+    <w:p>
       <w:pPr>
         <w:rPr>
           <w:rFonts w:ascii="Liberation Sans Regular" w:eastAsia="Liberation Sans Regular" w:hAnsi="Liberation Sans Regular" w:cs="Liberation Sans Regular"/>
@@ -138,7 +138,7 @@
         </w:rPr>
       </w:pPr>
     </w:p>
-    <w:p ns2:paraId="0576D7E2" ns2:textId="77777777">
+    <w:p>
       <w:pPr>
         <w:ind w:left="993"/>
         <w:rPr>
@@ -158,7 +158,7 @@
         <w:t>Ficha funcional del modelo</w:t>
       </w:r>
     </w:p>
-    <w:p ns2:paraId="3B449A25" ns2:textId="77777777">
+    <w:p>
       <w:pPr>
         <w:ind w:left="993"/>
         <w:rPr>
@@ -175,10 +175,10 @@
           <w:sz w:val="60"/>
           <w:szCs w:val="60"/>
         </w:rPr>
-        <w:t xml:space="preserve">a01 · wine-pest-disease-detection</w:t>
+        <w:t>a01 · wine-pest-disease-detection</w:t>
       </w:r>
     </w:p>
-    <w:p ns2:paraId="51DA5B40" ns2:textId="77777777">
+    <w:p>
       <w:pPr>
         <w:shd w:val="clear" w:color="auto" w:fill="E3EFDD"/>
         <w:ind w:left="993" w:right="2267" w:firstLine="140"/>
@@ -196,10 +196,10 @@
           <w:sz w:val="44"/>
           <w:szCs w:val="44"/>
         </w:rPr>
-        <w:t xml:space="preserve">Descripción de negocio para usuarios de la plataforma DatagIA</w:t>
+        <w:t>Descripción de negocio para usuarios de la plataforma DatagIA</w:t>
       </w:r>
     </w:p>
-    <w:p ns2:paraId="40EB8FF9" ns2:textId="77777777">
+    <w:p>
       <w:pPr>
         <w:ind w:left="993"/>
         <w:rPr>
@@ -216,185 +216,75 @@
           <w:sz w:val="32"/>
           <w:szCs w:val="32"/>
         </w:rPr>
-        <w:t xml:space="preserve">Octubre 2026</w:t>
+        <w:t>Octubre 2026</w:t>
       </w:r>
     </w:p>
-    <w:p ns2:paraId="27FF289D" ns2:textId="77777777">
+    <w:p>
       <w:r>
         <w:rPr>
           <w:noProof/>
         </w:rPr>
         <w:drawing>
-          <ns3:anchor distT="0" distB="0" distL="0" distR="0" simplePos="0" relativeHeight="251660288" behindDoc="1" locked="0" layoutInCell="1" hidden="0" allowOverlap="1" ns4:anchorId="39D70CED" ns4:editId="0A17AF9A">
-            <ns3:simplePos x="0" y="0"/>
-            <ns3:positionH relativeFrom="margin">
-              <ns3:align>center</ns3:align>
-            </ns3:positionH>
-            <ns3:positionV relativeFrom="margin">
-              <ns3:align>center</ns3:align>
-            </ns3:positionV>
-            <ns3:extent cx="5397500" cy="5280025"/>
-            <ns3:effectExtent l="0" t="0" r="0" b="0"/>
-            <ns3:wrapNone/>
-            <ns3:docPr id="1003" name="image2.png"/>
-            <ns3:cNvGraphicFramePr/>
-            <ns5:graphic>
-              <ns5:graphicData uri="http://schemas.openxmlformats.org/drawingml/2006/picture">
-                <ns6:pic>
-                  <ns6:nvPicPr>
-                    <ns6:cNvPr id="0" name="image2.png"/>
-                    <ns6:cNvPicPr preferRelativeResize="0"/>
-                  </ns6:nvPicPr>
-                  <ns6:blipFill>
-                    <ns5:blip ns7:embed="rId11"/>
-                    <ns5:srcRect/>
-                    <ns5:stretch>
-                      <ns5:fillRect/>
-                    </ns5:stretch>
-                  </ns6:blipFill>
-                  <ns6:spPr>
-                    <ns5:xfrm>
-                      <ns5:off x="0" y="0"/>
-                      <ns5:ext cx="5397500" cy="5280025"/>
-                    </ns5:xfrm>
-                    <ns5:prstGeom prst="rect">
-                      <ns5:avLst/>
-                    </ns5:prstGeom>
-                    <ns5:ln/>
-                  </ns6:spPr>
-                </ns6:pic>
-              </ns5:graphicData>
-            </ns5:graphic>
-          </ns3:anchor>
+          <wp:anchor distT="0" distB="0" distL="0" distR="0" simplePos="0" relativeHeight="251660288" behindDoc="1" locked="0" layoutInCell="1" hidden="0" allowOverlap="1" wp14:anchorId="39D70CED" wp14:editId="0A17AF9A">
+            <wp:simplePos x="0" y="0"/>
+            <wp:positionH relativeFrom="margin">
+              <wp:align>center</wp:align>
+            </wp:positionH>
+            <wp:positionV relativeFrom="margin">
+              <wp:align>center</wp:align>
+            </wp:positionV>
+            <wp:extent cx="5397500" cy="5280025"/>
+            <wp:effectExtent l="0" t="0" r="0" b="0"/>
+            <wp:wrapNone/>
+            <wp:docPr id="1003" name="image2.png"/>
+            <wp:cNvGraphicFramePr/>
+            <a:graphic xmlns:a="http://schemas.openxmlformats.org/drawingml/2006/main">
+              <a:graphicData uri="http://schemas.openxmlformats.org/drawingml/2006/picture">
+                <pic:pic xmlns:pic="http://schemas.openxmlformats.org/drawingml/2006/picture">
+                  <pic:nvPicPr>
+                    <pic:cNvPr id="0" name="image2.png"/>
+                    <pic:cNvPicPr preferRelativeResize="0"/>
+                  </pic:nvPicPr>
+                  <pic:blipFill>
+                    <a:blip r:embed="rId11"/>
+                    <a:srcRect/>
+                    <a:stretch>
+                      <a:fillRect/>
+                    </a:stretch>
+                  </pic:blipFill>
+                  <pic:spPr>
+                    <a:xfrm>
+                      <a:off x="0" y="0"/>
+                      <a:ext cx="5397500" cy="5280025"/>
+                    </a:xfrm>
+                    <a:prstGeom prst="rect">
+                      <a:avLst/>
+                    </a:prstGeom>
+                    <a:ln/>
+                  </pic:spPr>
+                </pic:pic>
+              </a:graphicData>
+            </a:graphic>
+          </wp:anchor>
         </w:drawing>
       </w:r>
       <w:r>
         <w:br w:type="page"/>
       </w:r>
     </w:p>
-    <w:p ns2:paraId="02C5CAC2" ns2:textId="77777777"/>
-    <w:p ns2:paraId="7933C1B1" ns2:textId="77777777"/>
-    <w:p ns2:paraId="61C7AC21" ns2:textId="77777777">
+    <w:p>
       <w:pPr>
-        <w:rPr>
-          <w:rFonts w:ascii="Liberalisation sans narrow" w:eastAsia="Liberalisation sans narrow" w:hAnsi="Liberalisation sans narrow" w:cs="Liberalisation sans narrow"/>
-          <w:b/>
-          <w:bCs/>
-        </w:rPr>
-      </w:pPr>
-    </w:p>
-    <w:p ns2:paraId="442353E4" ns2:textId="77777777">
-      <w:pPr>
-        <w:keepLines/>
-        <w:spacing w:before="120" w:after="120" w:line="276" w:lineRule="auto"/>
-        <w:jc w:val="both"/>
-        <w:rPr>
-          <w:rFonts w:ascii="Liberalisation sans narrow" w:eastAsia="Liberalisation sans narrow" w:hAnsi="Liberalisation sans narrow" w:cs="Liberalisation sans narrow"/>
-        </w:rPr>
-      </w:pPr>
-      <w:r>
-        <w:br w:type="page"/>
-      </w:r>
-    </w:p>
-    <w:p ns2:paraId="1A562CDE" ns2:textId="77777777">
-      <w:pPr>
-        <w:keepLines/>
-        <w:spacing w:before="120" w:after="120" w:line="276" w:lineRule="auto"/>
-        <w:jc w:val="both"/>
-        <w:rPr>
-          <w:rFonts w:ascii="Liberalisation sans narrow" w:eastAsia="Liberalisation sans narrow" w:hAnsi="Liberalisation sans narrow" w:cs="Liberalisation sans narrow"/>
-        </w:rPr>
-      </w:pPr>
-    </w:p>
-    <w:p ns2:paraId="77040EB8" ns2:textId="77777777">
-      <w:pPr>
-        <w:keepLines/>
-        <w:spacing w:before="120" w:after="120" w:line="276" w:lineRule="auto"/>
-        <w:jc w:val="both"/>
-        <w:rPr>
-          <w:rFonts w:ascii="Liberalisation sans narrow" w:eastAsia="Liberalisation sans narrow" w:hAnsi="Liberalisation sans narrow" w:cs="Liberalisation sans narrow"/>
-        </w:rPr>
-      </w:pPr>
-    </w:p>
-    <w:p ns2:paraId="586DF882" ns2:textId="2ED357CA">
-      <w:pPr>
-        <w:pBdr>
-          <w:top w:val="nil"/>
-          <w:left w:val="nil"/>
-          <w:bottom w:val="nil"/>
-          <w:right w:val="nil"/>
-          <w:between w:val="nil"/>
-        </w:pBdr>
-        <w:tabs>
-          <w:tab w:val="left" w:pos="960"/>
-          <w:tab w:val="right" w:pos="8494"/>
-        </w:tabs>
-        <w:spacing w:after="100"/>
-        <w:ind w:left="220"/>
-        <w:rPr>
-          <w:color w:val="000000"/>
-          <w:sz w:val="24"/>
-          <w:szCs w:val="24"/>
-        </w:rPr>
-      </w:pPr>
-    </w:p>
-    <w:p ns2:paraId="0DE37DC7" ns2:textId="77777777">
-      <w:pPr>
-        <w:rPr>
-          <w:rFonts w:ascii="Liberalisation sans narrow" w:eastAsia="Liberalisation sans narrow" w:hAnsi="Liberalisation sans narrow" w:cs="Liberalisation sans narrow"/>
-          <w:color w:val="203441"/>
-        </w:rPr>
-      </w:pPr>
-      <w:r>
-        <w:br w:type="page"/>
-      </w:r>
-    </w:p>
-    <w:p ns2:paraId="6B5CFA01" ns2:textId="77777777">
-      <w:pPr>
-        <w:pStyle w:val="Ttulo1"/>
+        <w:pStyle w:val="Heading1"/>
+        <w:jc w:val="left"/>
       </w:pPr>
       <w:bookmarkStart w:id="0" w:name="_heading=h.33jjin156j5n" w:colFirst="0" w:colLast="0"/>
+      <w:bookmarkStart w:id="1" w:name="_Toc233976909"/>
       <w:bookmarkEnd w:id="0"/>
-    </w:p>
-    <w:p ns2:paraId="59508226" ns2:textId="44329DDB">
-      <w:pPr>
-        <w:rPr>
-          <w:rFonts w:ascii="Liberation sans narrow" w:eastAsia="Liberation sans narrow" w:hAnsi="Liberation sans narrow" w:cs="Liberation sans narrow"/>
-        </w:rPr>
-      </w:pPr>
-      <w:r>
-        <w:rPr>
-          <w:rFonts w:ascii="Liberation sans narrow" w:eastAsia="Liberation sans narrow" w:hAnsi="Liberation sans narrow" w:cs="Liberation sans narrow"/>
-          <w:color w:val="739A8A" w:themeColor="text1"/>
-          <w:szCs w:val="24"/>
-          <w:lang w:val="en-US"/>
-        </w:rPr>
-        <w:fldChar w:fldCharType="end"/>
-      </w:r>
-    </w:p>
-    <w:p ns2:paraId="546A9A3A" ns2:textId="7EA5DBCB"/>
-    <w:p ns2:paraId="0EBFC326" ns2:textId="77777777">
-      <w:pPr>
-        <w:rPr>
-          <w:rFonts w:ascii="Liberation sans narrow" w:eastAsia="Liberation sans narrow" w:hAnsi="Liberation sans narrow" w:cs="Liberation sans narrow"/>
-          <w:color w:val="203441"/>
-        </w:rPr>
-      </w:pPr>
-      <w:r>
-        <w:br w:type="page"/>
-      </w:r>
-    </w:p>
-    <w:p ns2:paraId="5C32CB1B" ns2:textId="0F8D2751">
-      <w:pPr>
-        <w:pStyle w:val="Ttulo1"/>
-        <w:jc w:val="left"/>
-      </w:pPr>
-      <w:bookmarkStart w:id="5" w:name="_Toc233976909"/>
       <w:r>
         <w:lastRenderedPageBreak/>
         <w:t>1. Qué hace el modelo</w:t>
       </w:r>
-      <w:bookmarkEnd w:id="5"/>
+      <w:bookmarkEnd w:id="1"/>
       <w:r>
         <w:br/>
       </w:r>
@@ -418,7 +308,7 @@
         <w:gridCol w:w="2800"/>
         <w:gridCol w:w="6560"/>
       </w:tblGrid>
-      <w:tr ns2:paraId="60A61DA1" ns2:textId="77777777">
+      <w:tr>
         <w:tc>
           <w:tcPr>
             <w:tcW w:w="2800" w:type="dxa"/>
@@ -436,7 +326,7 @@
               <w:right w:w="120" w:type="dxa"/>
             </w:tcMar>
           </w:tcPr>
-          <w:p ns2:paraId="23A6BFC6" ns2:textId="77777777">
+          <w:p>
             <w:r>
               <w:rPr>
                 <w:b/>
@@ -466,14 +356,14 @@
               <w:right w:w="120" w:type="dxa"/>
             </w:tcMar>
           </w:tcPr>
-          <w:p ns2:paraId="4F17D729" ns2:textId="77777777">
-            <w:r>
-              <w:t xml:space="preserve">Un asistente de diagnóstico para la vid: le envías una foto de una hoja o un racimo, junto con las lecturas de los sensores de campo de los últimos 5 días, y te dice qué plaga o enfermedad hay (si la hay) y cómo de favorables están las condiciones ambientales para que se extienda.</w:t>
+          <w:p>
+            <w:r>
+              <w:t>Un asistente de diagnóstico para la vid: le envías una foto de una hoja o un racimo, junto con las lecturas de los sensores de campo de los últimos 5 días, y te dice qué plaga o enfermedad hay (si la hay) y cómo de favorables están las condiciones ambientales para que se extienda.</w:t>
             </w:r>
           </w:p>
         </w:tc>
       </w:tr>
-      <w:tr ns2:paraId="2EFAE6D1" ns2:textId="77777777">
+      <w:tr>
         <w:tc>
           <w:tcPr>
             <w:tcW w:w="2800" w:type="dxa"/>
@@ -491,7 +381,7 @@
               <w:right w:w="120" w:type="dxa"/>
             </w:tcMar>
           </w:tcPr>
-          <w:p ns2:paraId="5FCB8C3E" ns2:textId="77777777">
+          <w:p>
             <w:r>
               <w:rPr>
                 <w:b/>
@@ -521,14 +411,14 @@
               <w:right w:w="120" w:type="dxa"/>
             </w:tcMar>
           </w:tcPr>
-          <w:p ns2:paraId="1ED00FCD" ns2:textId="77777777">
-            <w:r>
-              <w:t xml:space="preserve">Detectar lo antes posible plagas y enfermedades en el viñedo, para que puedas intervenir solo donde y cuando hace falta, en vez de aplicar tratamientos fitosanitarios de forma preventiva y generalizada.</w:t>
+          <w:p>
+            <w:r>
+              <w:t>Detectar lo antes posible plagas y enfermedades en el viñedo, para que puedas intervenir solo donde y cuando hace falta, en vez de aplicar tratamientos fitosanitarios de forma preventiva y generalizada.</w:t>
             </w:r>
           </w:p>
         </w:tc>
       </w:tr>
-      <w:tr ns2:paraId="3FD753A3" ns2:textId="77777777">
+      <w:tr>
         <w:tc>
           <w:tcPr>
             <w:tcW w:w="2800" w:type="dxa"/>
@@ -546,7 +436,7 @@
               <w:right w:w="120" w:type="dxa"/>
             </w:tcMar>
           </w:tcPr>
-          <w:p ns2:paraId="6A75B45E" ns2:textId="77777777">
+          <w:p>
             <w:r>
               <w:rPr>
                 <w:b/>
@@ -576,21 +466,21 @@
               <w:right w:w="120" w:type="dxa"/>
             </w:tcMar>
           </w:tcPr>
-          <w:p ns2:paraId="40956F30" ns2:textId="77777777">
-            <w:r>
-              <w:t xml:space="preserve">Haces una foto a una hoja o racimo con dudas, recoges la lectura de los sensores de la zona de los últimos 5 días, y envías ambas cosas al sistema. Si tienes foto, te devuelve el diagnóstico (una de 15 plagas/enfermedades conocidas, o 'sana') junto con el riesgo ambiental. Si no tienes foto a mano, igualmente puedes consultar solo el riesgo ambiental con los sensores.</w:t>
+          <w:p>
+            <w:r>
+              <w:t>Haces una foto a una hoja o racimo con dudas, recoges la lectura de los sensores de la zona de los últimos 5 días, y envías ambas cosas al sistema. Si tienes foto, te devuelve el diagnóstico (una de 15 plagas/enfermedades conocidas, o 'sana') junto con el riesgo ambiental. Si no tienes foto a mano, igualmente puedes consultar solo el riesgo ambiental con los sensores.</w:t>
             </w:r>
           </w:p>
         </w:tc>
       </w:tr>
     </w:tbl>
-    <w:p ns2:paraId="42B06DD4" ns2:textId="5A91ADB2">
+    <w:p>
       <w:pPr>
-        <w:pStyle w:val="Descripcin"/>
+        <w:pStyle w:val="Caption"/>
         <w:jc w:val="center"/>
       </w:pPr>
-      <w:bookmarkStart w:id="6" w:name="_Toc233977245"/>
-      <w:bookmarkStart w:id="7" w:name="_Toc233977283"/>
+      <w:bookmarkStart w:id="2" w:name="_Toc233977245"/>
+      <w:bookmarkStart w:id="3" w:name="_Toc233977283"/>
       <w:r>
         <w:t xml:space="preserve">Tabla </w:t>
       </w:r>
@@ -605,38 +495,38 @@
       <w:r>
         <w:t xml:space="preserve"> Descripción general del modelo</w:t>
       </w:r>
-      <w:bookmarkEnd w:id="6"/>
-      <w:bookmarkEnd w:id="7"/>
+      <w:bookmarkEnd w:id="2"/>
+      <w:bookmarkEnd w:id="3"/>
     </w:p>
-    <w:p ns2:paraId="05724126" ns2:textId="77777777">
+    <w:p>
       <w:pPr>
         <w:jc w:val="both"/>
       </w:pPr>
       <w:r>
-        <w:t xml:space="preserve">No te dice qué tratamiento aplicar ni en qué dosis, ni sustituye la inspección de un técnico agrónomo ante un caso dudoso o grave — es una ayuda a la decisión, no un diagnóstico clínico definitivo.</w:t>
+        <w:t>No te dice qué tratamiento aplicar ni en qué dosis, ni sustituye la inspección de un técnico agrónomo ante un caso dudoso o grave — es una ayuda a la decisión, no un diagnóstico clínico definitivo.</w:t>
       </w:r>
     </w:p>
-    <w:p ns2:paraId="0B3A0E33" ns2:textId="77777777"/>
-    <w:p ns2:paraId="4D3F6144" ns2:textId="77777777">
+    <w:p/>
+    <w:p>
       <w:pPr>
-        <w:pStyle w:val="Ttulo1"/>
+        <w:pStyle w:val="Heading1"/>
         <w:jc w:val="left"/>
       </w:pPr>
-      <w:bookmarkStart w:id="8" w:name="_Toc233976910"/>
+      <w:bookmarkStart w:id="4" w:name="_Toc233976910"/>
       <w:r>
         <w:t>2. Qué necesito darle (entradas)</w:t>
       </w:r>
-      <w:bookmarkEnd w:id="8"/>
+      <w:bookmarkEnd w:id="4"/>
     </w:p>
-    <w:p ns2:paraId="5D23DC51" ns2:textId="43C7F867">
+    <w:p>
       <w:pPr>
         <w:jc w:val="both"/>
       </w:pPr>
       <w:r>
-        <w:t xml:space="preserve">Los datos vienen de dos sitios: una foto que tú mismo tomas en campo (hoja o racimo) y las lecturas de los sensores IIoT ya instalados en la parcela (temperatura, humedad, lluvia, etc. de los últimos 5 días).</w:t>
+        <w:t>Los datos vienen de dos sitios: una foto que tú mismo tomas en campo (hoja o racimo) y las lecturas de los sensores IIoT ya instalados en la parcela (temperatura, humedad, lluvia, etc. de los últimos 5 días).</w:t>
       </w:r>
     </w:p>
-    <w:p ns2:paraId="6D2C7225" ns2:textId="77777777"/>
+    <w:p/>
     <w:tbl>
       <w:tblPr>
         <w:tblStyle w:val="a0"/>
@@ -656,7 +546,7 @@
         <w:gridCol w:w="3884"/>
         <w:gridCol w:w="5476"/>
       </w:tblGrid>
-      <w:tr ns2:paraId="6C80E726" ns2:textId="77777777">
+      <w:tr>
         <w:trPr>
           <w:tblHeader/>
         </w:trPr>
@@ -677,7 +567,7 @@
               <w:right w:w="120" w:type="dxa"/>
             </w:tcMar>
           </w:tcPr>
-          <w:p ns2:paraId="13834406" ns2:textId="77777777">
+          <w:p>
             <w:r>
               <w:rPr>
                 <w:b/>
@@ -707,7 +597,7 @@
               <w:right w:w="120" w:type="dxa"/>
             </w:tcMar>
           </w:tcPr>
-          <w:p ns2:paraId="2DD5573F" ns2:textId="77777777">
+          <w:p>
             <w:r>
               <w:rPr>
                 <w:b/>
@@ -721,7 +611,7 @@
           </w:p>
         </w:tc>
       </w:tr>
-      <w:tr ns2:paraId="39E09196" ns2:textId="77777777">
+      <w:tr>
         <w:tc>
           <w:tcPr>
             <w:tcW w:w="2167" w:type="dxa"/>
@@ -739,9 +629,9 @@
               <w:right w:w="120" w:type="dxa"/>
             </w:tcMar>
           </w:tcPr>
-          <w:p ns2:paraId="02741774" ns2:textId="77777777">
-            <w:r>
-              <w:t xml:space="preserve">Foto de hoja o racimo</w:t>
+          <w:p>
+            <w:r>
+              <w:t>Foto de hoja o racimo</w:t>
             </w:r>
           </w:p>
         </w:tc>
@@ -762,14 +652,14 @@
               <w:right w:w="120" w:type="dxa"/>
             </w:tcMar>
           </w:tcPr>
-          <w:p ns2:paraId="3AB481B3" ns2:textId="77777777">
-            <w:r>
-              <w:t xml:space="preserve">Una imagen tomada en campo; el sistema localiza y recorta automáticamente la zona de interés antes de analizarla. Es opcional: sin foto, el sistema solo te da el riesgo ambiental.</w:t>
+          <w:p>
+            <w:r>
+              <w:t>Una imagen tomada en campo; el sistema localiza y recorta automáticamente la zona de interés antes de analizarla. Es opcional: sin foto, el sistema solo te da el riesgo ambiental.</w:t>
             </w:r>
           </w:p>
         </w:tc>
       </w:tr>
-      <w:tr ns2:paraId="39E09196" ns2:textId="77777777">
+      <w:tr>
         <w:tc>
           <w:tcPr>
             <w:tcW w:w="2167" w:type="dxa"/>
@@ -787,9 +677,9 @@
               <w:right w:w="120" w:type="dxa"/>
             </w:tcMar>
           </w:tcPr>
-          <w:p ns2:paraId="02741774" ns2:textId="77777777">
-            <w:r>
-              <w:t xml:space="preserve">Lecturas de los sensores de los últimos 5 días</w:t>
+          <w:p>
+            <w:r>
+              <w:t>Lecturas de los sensores de los últimos 5 días</w:t>
             </w:r>
           </w:p>
         </w:tc>
@@ -810,14 +700,18 @@
               <w:right w:w="120" w:type="dxa"/>
             </w:tcMar>
           </w:tcPr>
-          <w:p ns2:paraId="3AB481B3" ns2:textId="77777777">
-            <w:r>
-              <w:t xml:space="preserve">Mes, temperaturas máxima/mínima media, humedad relativa máxima/mínima, humedad del suelo, lluvia acumulada, horas de humedad foliar y grados-día acumulados. Hacen falta los 9 valores.</w:t>
+          <w:p>
+            <w:r>
+              <w:t xml:space="preserve">Mes, temperaturas máxima/mínima media, humedad relativa máxima/mínima, humedad del suelo, lluvia acumulada, horas de humedad foliar </w:t>
+            </w:r>
+            <w:r>
+              <w:lastRenderedPageBreak/>
+              <w:t>y grados-día acumulados. Hacen falta los 9 valores.</w:t>
             </w:r>
           </w:p>
         </w:tc>
       </w:tr>
-      <w:tr ns2:paraId="39E09196" ns2:textId="77777777">
+      <w:tr>
         <w:tc>
           <w:tcPr>
             <w:tcW w:w="2167" w:type="dxa"/>
@@ -835,9 +729,10 @@
               <w:right w:w="120" w:type="dxa"/>
             </w:tcMar>
           </w:tcPr>
-          <w:p ns2:paraId="02741774" ns2:textId="77777777">
-            <w:r>
-              <w:t xml:space="preserve">Fotos y sensores de varias muestras a la vez (lote)</w:t>
+          <w:p>
+            <w:r>
+              <w:lastRenderedPageBreak/>
+              <w:t>Fotos y sensores de varias muestras a la vez (lote)</w:t>
             </w:r>
           </w:p>
         </w:tc>
@@ -858,21 +753,21 @@
               <w:right w:w="120" w:type="dxa"/>
             </w:tcMar>
           </w:tcPr>
-          <w:p ns2:paraId="3AB481B3" ns2:textId="77777777">
-            <w:r>
-              <w:t xml:space="preserve">Si tienes que revisar varias zonas de golpe, puedes subir un archivo comprimido con todas las fotos y un listado de sensores por foto, en vez de consultarlas una a una.</w:t>
+          <w:p>
+            <w:r>
+              <w:t>Si tienes que revisar varias zonas de golpe, puedes subir un archivo comprimido con todas las fotos y un listado de sensores por foto, en vez de consultarlas una a una.</w:t>
             </w:r>
           </w:p>
         </w:tc>
       </w:tr>
     </w:tbl>
-    <w:p ns2:paraId="7ADAB195" ns2:textId="6B2EA1F7">
+    <w:p>
       <w:pPr>
-        <w:pStyle w:val="Descripcin"/>
+        <w:pStyle w:val="Caption"/>
         <w:jc w:val="center"/>
       </w:pPr>
-      <w:bookmarkStart w:id="9" w:name="_Toc233977246"/>
-      <w:bookmarkStart w:id="10" w:name="_Toc233977284"/>
+      <w:bookmarkStart w:id="5" w:name="_Toc233977246"/>
+      <w:bookmarkStart w:id="6" w:name="_Toc233977284"/>
       <w:r>
         <w:t xml:space="preserve">Tabla </w:t>
       </w:r>
@@ -887,20 +782,20 @@
       <w:r>
         <w:t xml:space="preserve"> Campos de entrada (inputs)</w:t>
       </w:r>
-      <w:bookmarkEnd w:id="9"/>
-      <w:bookmarkEnd w:id="10"/>
+      <w:bookmarkEnd w:id="5"/>
+      <w:bookmarkEnd w:id="6"/>
     </w:p>
-    <w:p ns2:paraId="2D75DAE3" ns2:textId="77777777"/>
-    <w:p ns2:paraId="1D5B0A63" ns2:textId="77777777">
+    <w:p/>
+    <w:p>
       <w:pPr>
-        <w:pStyle w:val="Ttulo1"/>
+        <w:pStyle w:val="Heading1"/>
         <w:jc w:val="left"/>
       </w:pPr>
-      <w:bookmarkStart w:id="11" w:name="_Toc233976911"/>
+      <w:bookmarkStart w:id="7" w:name="_Toc233976911"/>
       <w:r>
         <w:t>3. Qué me devuelve (salidas)</w:t>
       </w:r>
-      <w:bookmarkEnd w:id="11"/>
+      <w:bookmarkEnd w:id="7"/>
     </w:p>
     <w:tbl>
       <w:tblPr>
@@ -922,7 +817,7 @@
         <w:gridCol w:w="3510"/>
         <w:gridCol w:w="2633"/>
       </w:tblGrid>
-      <w:tr ns2:paraId="30598A3A" ns2:textId="77777777">
+      <w:tr>
         <w:trPr>
           <w:tblHeader/>
         </w:trPr>
@@ -943,7 +838,7 @@
               <w:right w:w="120" w:type="dxa"/>
             </w:tcMar>
           </w:tcPr>
-          <w:p ns2:paraId="48AA3C39" ns2:textId="77777777">
+          <w:p>
             <w:r>
               <w:rPr>
                 <w:b/>
@@ -973,7 +868,7 @@
               <w:right w:w="120" w:type="dxa"/>
             </w:tcMar>
           </w:tcPr>
-          <w:p ns2:paraId="45D542C1" ns2:textId="77777777">
+          <w:p>
             <w:r>
               <w:rPr>
                 <w:b/>
@@ -1003,7 +898,7 @@
               <w:right w:w="120" w:type="dxa"/>
             </w:tcMar>
           </w:tcPr>
-          <w:p ns2:paraId="216EBD1B" ns2:textId="77777777">
+          <w:p>
             <w:r>
               <w:rPr>
                 <w:b/>
@@ -1017,7 +912,7 @@
           </w:p>
         </w:tc>
       </w:tr>
-      <w:tr ns2:paraId="0BD31A91" ns2:textId="77777777">
+      <w:tr>
         <w:tc>
           <w:tcPr>
             <w:tcW w:w="2200" w:type="dxa"/>
@@ -1035,9 +930,9 @@
               <w:right w:w="120" w:type="dxa"/>
             </w:tcMar>
           </w:tcPr>
-          <w:p ns2:paraId="2CD654FD" ns2:textId="77777777">
-            <w:r>
-              <w:t xml:space="preserve">Diagnóstico</w:t>
+          <w:p>
+            <w:r>
+              <w:t>Diagnóstico</w:t>
             </w:r>
           </w:p>
         </w:tc>
@@ -1058,9 +953,9 @@
               <w:right w:w="120" w:type="dxa"/>
             </w:tcMar>
           </w:tcPr>
-          <w:p ns2:paraId="35872DC0" ns2:textId="77777777">
-            <w:r>
-              <w:t xml:space="preserve">La plaga o enfermedad detectada (o 'sana'), o un aviso de que no se ha podido analizar la foto.</w:t>
+          <w:p>
+            <w:r>
+              <w:t>La plaga o enfermedad detectada (o 'sana'), o un aviso de que no se ha podido analizar la foto.</w:t>
             </w:r>
           </w:p>
         </w:tc>
@@ -1081,14 +976,14 @@
               <w:right w:w="120" w:type="dxa"/>
             </w:tcMar>
           </w:tcPr>
-          <w:p ns2:paraId="1DF2EF4D" ns2:textId="77777777">
-            <w:r>
-              <w:t xml:space="preserve">Si no mandaste foto, este campo saldrá como 'sin imagen disponible' — solo tendrás el riesgo ambiental, no el diagnóstico.</w:t>
+          <w:p>
+            <w:r>
+              <w:t>Si no mandaste foto, este campo saldrá como 'sin imagen disponible' — solo tendrás el riesgo ambiental, no el diagnóstico.</w:t>
             </w:r>
           </w:p>
         </w:tc>
       </w:tr>
-      <w:tr ns2:paraId="0BD31A91" ns2:textId="77777777">
+      <w:tr>
         <w:tc>
           <w:tcPr>
             <w:tcW w:w="2200" w:type="dxa"/>
@@ -1106,9 +1001,9 @@
               <w:right w:w="120" w:type="dxa"/>
             </w:tcMar>
           </w:tcPr>
-          <w:p ns2:paraId="2CD654FD" ns2:textId="77777777">
-            <w:r>
-              <w:t xml:space="preserve">Confianza del diagnóstico</w:t>
+          <w:p>
+            <w:r>
+              <w:t>Confianza del diagnóstico</w:t>
             </w:r>
           </w:p>
         </w:tc>
@@ -1129,9 +1024,9 @@
               <w:right w:w="120" w:type="dxa"/>
             </w:tcMar>
           </w:tcPr>
-          <w:p ns2:paraId="35872DC0" ns2:textId="77777777">
-            <w:r>
-              <w:t xml:space="preserve">Qué tan de acuerdo están entre sí los tres modelos que componen el sistema a la hora de dar ese diagnóstico.</w:t>
+          <w:p>
+            <w:r>
+              <w:t>Qué tan de acuerdo están entre sí los tres modelos que componen el sistema a la hora de dar ese diagnóstico.</w:t>
             </w:r>
           </w:p>
         </w:tc>
@@ -1152,14 +1047,14 @@
               <w:right w:w="120" w:type="dxa"/>
             </w:tcMar>
           </w:tcPr>
-          <w:p ns2:paraId="1DF2EF4D" ns2:textId="77777777">
-            <w:r>
-              <w:t xml:space="preserve">Cuanto más alta, más fiable es el diagnóstico. Si es baja, conviene revisar la muestra a mano.</w:t>
+          <w:p>
+            <w:r>
+              <w:t>Cuanto más alta, más fiable es el diagnóstico. Si es baja, conviene revisar la muestra a mano.</w:t>
             </w:r>
           </w:p>
         </w:tc>
       </w:tr>
-      <w:tr ns2:paraId="0BD31A91" ns2:textId="77777777">
+      <w:tr>
         <w:tc>
           <w:tcPr>
             <w:tcW w:w="2200" w:type="dxa"/>
@@ -1177,9 +1072,9 @@
               <w:right w:w="120" w:type="dxa"/>
             </w:tcMar>
           </w:tcPr>
-          <w:p ns2:paraId="2CD654FD" ns2:textId="77777777">
-            <w:r>
-              <w:t xml:space="preserve">Índice de riesgo</w:t>
+          <w:p>
+            <w:r>
+              <w:t>Índice de riesgo</w:t>
             </w:r>
           </w:p>
         </w:tc>
@@ -1200,9 +1095,9 @@
               <w:right w:w="120" w:type="dxa"/>
             </w:tcMar>
           </w:tcPr>
-          <w:p ns2:paraId="35872DC0" ns2:textId="77777777">
-            <w:r>
-              <w:t xml:space="preserve">Un número entre 0 y 1 que indica cómo de favorables están las condiciones ambientales (humedad, temperatura...) para que la plaga o enfermedad se extienda.</w:t>
+          <w:p>
+            <w:r>
+              <w:t>Un número entre 0 y 1 que indica cómo de favorables están las condiciones ambientales (humedad, temperatura...) para que la plaga o enfermedad se extienda.</w:t>
             </w:r>
           </w:p>
         </w:tc>
@@ -1223,14 +1118,14 @@
               <w:right w:w="120" w:type="dxa"/>
             </w:tcMar>
           </w:tcPr>
-          <w:p ns2:paraId="1DF2EF4D" ns2:textId="77777777">
-            <w:r>
-              <w:t xml:space="preserve">Tómalo como orientación, no como dato preciso: en las pruebas, el índice apenas mejora a dar siempre el mismo valor medio. No lo uses por sí solo para decidir un tratamiento.</w:t>
+          <w:p>
+            <w:r>
+              <w:t>Tómalo como orientación, no como dato preciso: en las pruebas, el índice apenas mejora a dar siempre el mismo valor medio. No lo uses por sí solo para decidir un tratamiento.</w:t>
             </w:r>
           </w:p>
         </w:tc>
       </w:tr>
-      <w:tr ns2:paraId="0BD31A91" ns2:textId="77777777">
+      <w:tr>
         <w:tc>
           <w:tcPr>
             <w:tcW w:w="2200" w:type="dxa"/>
@@ -1248,9 +1143,9 @@
               <w:right w:w="120" w:type="dxa"/>
             </w:tcMar>
           </w:tcPr>
-          <w:p ns2:paraId="2CD654FD" ns2:textId="77777777">
-            <w:r>
-              <w:t xml:space="preserve">Método usado</w:t>
+          <w:p>
+            <w:r>
+              <w:t>Método usado</w:t>
             </w:r>
           </w:p>
         </w:tc>
@@ -1271,9 +1166,9 @@
               <w:right w:w="120" w:type="dxa"/>
             </w:tcMar>
           </w:tcPr>
-          <w:p ns2:paraId="35872DC0" ns2:textId="77777777">
-            <w:r>
-              <w:t xml:space="preserve">Si el resultado viene de analizar la foto (diagnóstico + riesgo fiables) o solo de los sensores (riesgo únicamente, sin diagnóstico de la foto).</w:t>
+          <w:p>
+            <w:r>
+              <w:t>Si el resultado viene de analizar la foto (diagnóstico + riesgo fiables) o solo de los sensores (riesgo únicamente, sin diagnóstico de la foto).</w:t>
             </w:r>
           </w:p>
         </w:tc>
@@ -1294,22 +1189,23 @@
               <w:right w:w="120" w:type="dxa"/>
             </w:tcMar>
           </w:tcPr>
-          <w:p ns2:paraId="1DF2EF4D" ns2:textId="77777777">
-            <w:r>
-              <w:t xml:space="preserve">Te permite saber si el diagnóstico es real o si solo tienes la estimación de riesgo ambiental.</w:t>
+          <w:p>
+            <w:r>
+              <w:t>Te permite saber si el diagnóstico es real o si solo tienes la estimación de riesgo ambiental.</w:t>
             </w:r>
           </w:p>
         </w:tc>
       </w:tr>
     </w:tbl>
-    <w:p ns2:paraId="550B7902" ns2:textId="22FA894B">
+    <w:p>
       <w:pPr>
-        <w:pStyle w:val="Descripcin"/>
+        <w:pStyle w:val="Caption"/>
         <w:jc w:val="center"/>
       </w:pPr>
-      <w:bookmarkStart w:id="12" w:name="_Toc233977247"/>
-      <w:bookmarkStart w:id="13" w:name="_Toc233977285"/>
+      <w:bookmarkStart w:id="8" w:name="_Toc233977247"/>
+      <w:bookmarkStart w:id="9" w:name="_Toc233977285"/>
       <w:r>
+        <w:lastRenderedPageBreak/>
         <w:t xml:space="preserve">Tabla </w:t>
       </w:r>
       <w:fldSimple w:instr=" SEQ Tabla \* ARABIC ">
@@ -1323,134 +1219,134 @@
       <w:r>
         <w:t xml:space="preserve"> Campos de salida (outputs)</w:t>
       </w:r>
-      <w:bookmarkEnd w:id="12"/>
-      <w:bookmarkEnd w:id="13"/>
+      <w:bookmarkEnd w:id="8"/>
+      <w:bookmarkEnd w:id="9"/>
     </w:p>
-    <w:p ns2:paraId="342E22E9" ns2:textId="77777777">
+    <w:p>
       <w:pPr>
-        <w:pStyle w:val="Ttulo1"/>
+        <w:pStyle w:val="Heading1"/>
         <w:jc w:val="left"/>
       </w:pPr>
-      <w:bookmarkStart w:id="14" w:name="_Toc233976912"/>
+      <w:bookmarkStart w:id="10" w:name="_Toc233976912"/>
       <w:r>
         <w:t>4. Cómo leo el resultado</w:t>
       </w:r>
-      <w:bookmarkEnd w:id="14"/>
+      <w:bookmarkEnd w:id="10"/>
     </w:p>
-    <w:p ns2:paraId="68FE0EAC" ns2:textId="77777777">
+    <w:p>
       <w:pPr>
         <w:jc w:val="both"/>
       </w:pPr>
       <w:r>
-        <w:t xml:space="preserve">Si envías una foto de una hoja con manchas y los sensores de la zona, y el sistema devuelve 'MILDIU' con confianza 0,95 y riesgo 0,65, significa: alta seguridad de que es mildiu, y las condiciones ambientales actuales son razonablemente favorables para que progrese — conviene intervenir pronto. Si en cambio no mandas foto y solo consultas los sensores, el sistema solo te dará ese 0,65 de riesgo, sin decirte si hay o no una enfermedad presente.</w:t>
+        <w:t>Si envías una foto de una hoja con manchas y los sensores de la zona, y el sistema devuelve 'MILDIU' con confianza 0,95 y riesgo 0,65, significa: alta seguridad de que es mildiu, y las condiciones ambientales actuales son razonablemente favorables para que progrese — conviene intervenir pronto. Si en cambio no mandas foto y solo consultas los sensores, el sistema solo te dará ese 0,65 de riesgo, sin decirte si hay o no una enfermedad presente.</w:t>
       </w:r>
     </w:p>
-    <w:p ns2:paraId="7585C801" ns2:textId="77777777">
+    <w:p>
       <w:pPr>
         <w:jc w:val="both"/>
       </w:pPr>
     </w:p>
-    <w:p ns2:paraId="2856C14E" ns2:textId="77777777">
+    <w:p>
       <w:pPr>
         <w:jc w:val="both"/>
       </w:pPr>
       <w:r>
-        <w:t xml:space="preserve">De cada 100 fotos analizadas, el sistema acierta en el diagnóstico en unas 95 (verificado de forma independiente sobre 1470 fotos reales: 94,7%; con fotos de cámara a resolución completa, en torno al 94%). Para algunas plagas poco frecuentes (Lobesia, Oídio en racimo, mosquito verde) acierta solo unas 6 de cada 10 veces — en esos casos conviene no fiarse solo del diagnóstico automático. El índice de riesgo es solo orientativo.</w:t>
+        <w:t>De cada 100 fotos analizadas, el sistema acierta en el diagnóstico en unas 95 (verificado de forma independiente sobre 1470 fotos reales: 94,7%; con fotos de cámara a resolución completa, en torno al 94%). Para algunas plagas poco frecuentes (Lobesia, Oídio en racimo, mosquito verde) acierta solo unas 6 de cada 10 veces — en esos casos conviene no fiarse solo del diagnóstico automático. El índice de riesgo es solo orientativo.</w:t>
       </w:r>
     </w:p>
-    <w:p ns2:paraId="23429964" ns2:textId="77777777"/>
-    <w:p ns2:paraId="4D0352D1" ns2:textId="77777777">
+    <w:p/>
+    <w:p>
       <w:pPr>
-        <w:pStyle w:val="Ttulo1"/>
+        <w:pStyle w:val="Heading1"/>
         <w:jc w:val="left"/>
       </w:pPr>
-      <w:bookmarkStart w:id="15" w:name="_Toc233976913"/>
+      <w:bookmarkStart w:id="11" w:name="_Toc233976913"/>
       <w:r>
         <w:t>5. Cuándo debo revisar manualmente</w:t>
       </w:r>
-      <w:bookmarkEnd w:id="15"/>
+      <w:bookmarkEnd w:id="11"/>
     </w:p>
-    <w:p ns2:paraId="2053022C" ns2:textId="77777777">
+    <w:p>
       <w:r>
-        <w:t xml:space="preserve">•  Diagnósticos de Lobesia, Oídio en racimo o mosquito verde (Empoasca) con confianza baja — son las plagas donde el sistema acierta menos.</w:t>
+        <w:t>•  Diagnósticos de Lobesia, Oídio en racimo o mosquito verde (Empoasca) con confianza baja — son las plagas donde el sistema acierta menos.</w:t>
       </w:r>
     </w:p>
-    <w:p ns2:paraId="2053022C" ns2:textId="77777777">
+    <w:p>
       <w:r>
-        <w:t xml:space="preserve">•  Cualquier diagnóstico con confianza por debajo de un tercio (los tres modelos no se ponen de acuerdo entre sí).</w:t>
+        <w:t>•  Cualquier diagnóstico con confianza por debajo de un tercio (los tres modelos no se ponen de acuerdo entre sí).</w:t>
       </w:r>
     </w:p>
-    <w:p ns2:paraId="2053022C" ns2:textId="77777777">
+    <w:p>
       <w:r>
-        <w:t xml:space="preserve">•  El índice de riesgo en general — en las pruebas apenas acierta más que un valor fijo, así que no sirve para decidir por sí solo.</w:t>
+        <w:t>•  El índice de riesgo en general — en las pruebas apenas acierta más que un valor fijo, así que no sirve para decidir por sí solo.</w:t>
       </w:r>
     </w:p>
-    <w:p ns2:paraId="2053022C" ns2:textId="77777777">
+    <w:p>
       <w:r>
-        <w:t xml:space="preserve">•  Fotos tomadas con una cámara térmica fuera de su resolución habitual, o en condiciones de campo muy distintas a las habituales (polvo, contraluz extremo...).</w:t>
+        <w:t>•  Fotos tomadas con una cámara térmica fuera de su resolución habitual, o en condiciones de campo muy distintas a las habituales (polvo, contraluz extremo...).</w:t>
       </w:r>
     </w:p>
-    <w:p ns2:paraId="04A0CF39" ns2:textId="77777777"/>
-    <w:p ns2:paraId="283A7D53" ns2:textId="77777777">
+    <w:p/>
+    <w:p>
       <w:pPr>
-        <w:pStyle w:val="Ttulo1"/>
+        <w:pStyle w:val="Heading1"/>
         <w:jc w:val="left"/>
       </w:pPr>
-      <w:bookmarkStart w:id="16" w:name="_Toc233976914"/>
+      <w:bookmarkStart w:id="12" w:name="_Toc233976914"/>
+      <w:r>
+        <w:t>6. Qué no hace el modelo</w:t>
+      </w:r>
+      <w:bookmarkEnd w:id="12"/>
+    </w:p>
+    <w:p>
+      <w:r>
+        <w:t>•  No recomienda el tratamiento fitosanitario a aplicar, solo diagnostica y estima el riesgo.</w:t>
+      </w:r>
+    </w:p>
+    <w:p>
+      <w:r>
+        <w:t>•  No sustituye la confirmación de un técnico agrónomo en casos dudosos o de alto impacto económico.</w:t>
+      </w:r>
+    </w:p>
+    <w:p>
       <w:r>
         <w:lastRenderedPageBreak/>
-        <w:t>6. Qué no hace el modelo</w:t>
-      </w:r>
-      <w:bookmarkEnd w:id="16"/>
-    </w:p>
-    <w:p ns2:paraId="36E72011" ns2:textId="77777777">
-      <w:r>
-        <w:t xml:space="preserve">•  No recomienda el tratamiento fitosanitario a aplicar, solo diagnostica y estima el riesgo.</w:t>
+        <w:t>•  No detecta deficiencias nutricionales ni otras co-infecciones que no sean una de las 15 categorías entrenadas.</w:t>
       </w:r>
     </w:p>
-    <w:p ns2:paraId="36E72011" ns2:textId="77777777">
+    <w:p>
       <w:r>
-        <w:t xml:space="preserve">•  No sustituye la confirmación de un técnico agrónomo en casos dudosos o de alto impacto económico.</w:t>
+        <w:t>•  No actualiza el riesgo ambiental en tiempo real por sí solo si los sensores dejan de enviar datos — depende de que la telemetría de campo funcione.</w:t>
       </w:r>
     </w:p>
-    <w:p ns2:paraId="36E72011" ns2:textId="77777777">
-      <w:r>
-        <w:t xml:space="preserve">•  No detecta deficiencias nutricionales ni otras co-infecciones que no sean una de las 15 categorías entrenadas.</w:t>
-      </w:r>
-    </w:p>
-    <w:p ns2:paraId="36E72011" ns2:textId="77777777">
-      <w:r>
-        <w:t xml:space="preserve">•  No actualiza el riesgo ambiental en tiempo real por sí solo si los sensores dejan de enviar datos — depende de que la telemetría de campo funcione.</w:t>
-      </w:r>
-    </w:p>
-    <w:p ns2:paraId="3A0ADEDC" ns2:textId="77777777"/>
-    <w:p ns2:paraId="4E1464CE" ns2:textId="77777777">
+    <w:p/>
+    <w:p>
       <w:pPr>
-        <w:pStyle w:val="Ttulo1"/>
+        <w:pStyle w:val="Heading1"/>
         <w:jc w:val="left"/>
       </w:pPr>
-      <w:bookmarkStart w:id="17" w:name="_Toc233976915"/>
+      <w:bookmarkStart w:id="13" w:name="_Toc233976915"/>
       <w:r>
         <w:t>7. Puede equivocarse</w:t>
       </w:r>
-      <w:bookmarkEnd w:id="17"/>
+      <w:bookmarkEnd w:id="13"/>
     </w:p>
-    <w:p ns2:paraId="7F6C063A" ns2:textId="77777777">
+    <w:p>
       <w:r>
-        <w:t xml:space="preserve">Sí, como cualquier sistema automático. Acierta en el diagnóstico en torno al 95% de las veces, verificado contra casi 1500 fotos reales, pero ese porcentaje es bastante más bajo para las plagas menos frecuentes. El índice de riesgo no es fiable: tómalo solo como orientación. Es una herramienta de apoyo a la decisión del viticultor, no una garantía absoluta — las decisiones de tratamiento importantes conviene confirmarlas con criterio humano.</w:t>
+        <w:t>Sí, como cualquier sistema automático. Acierta en el diagnóstico en torno al 95% de las veces, verificado contra casi 1500 fotos reales, pero ese porcentaje es bastante más bajo para las plagas menos frecuentes. El índice de riesgo no es fiable: tómalo solo como orientación. Es una herramienta de apoyo a la decisión del viticultor, no una garantía absoluta — las decisiones de tratamiento importantes conviene confirmarlas con criterio humano.</w:t>
       </w:r>
     </w:p>
-    <w:p ns2:paraId="6E37E5A4" ns2:textId="77777777"/>
-    <w:p ns2:paraId="7171A71B" ns2:textId="77777777">
+    <w:p/>
+    <w:p>
       <w:pPr>
-        <w:pStyle w:val="Ttulo1"/>
+        <w:pStyle w:val="Heading1"/>
         <w:jc w:val="left"/>
       </w:pPr>
-      <w:bookmarkStart w:id="18" w:name="_Toc233976916"/>
+      <w:bookmarkStart w:id="14" w:name="_Toc233976916"/>
       <w:r>
-        <w:t xml:space="preserve">8. KPIs del modelo</w:t>
+        <w:t>8. KPIs del modelo</w:t>
       </w:r>
-      <w:bookmarkEnd w:id="18"/>
+      <w:bookmarkEnd w:id="14"/>
     </w:p>
     <w:tbl>
       <w:tblPr>
@@ -1472,7 +1368,7 @@
         <w:gridCol w:w="3280"/>
         <w:gridCol w:w="3280"/>
       </w:tblGrid>
-      <w:tr ns2:paraId="722801F3" ns2:textId="77777777">
+      <w:tr>
         <w:trPr>
           <w:tblHeader/>
         </w:trPr>
@@ -1493,7 +1389,7 @@
               <w:right w:w="120" w:type="dxa"/>
             </w:tcMar>
           </w:tcPr>
-          <w:p ns2:paraId="3024B19E" ns2:textId="77777777">
+          <w:p>
             <w:r>
               <w:rPr>
                 <w:b/>
@@ -1523,7 +1419,7 @@
               <w:right w:w="120" w:type="dxa"/>
             </w:tcMar>
           </w:tcPr>
-          <w:p ns2:paraId="0ABEC927" ns2:textId="77777777">
+          <w:p>
             <w:r>
               <w:rPr>
                 <w:b/>
@@ -1553,7 +1449,7 @@
               <w:right w:w="120" w:type="dxa"/>
             </w:tcMar>
           </w:tcPr>
-          <w:p ns2:paraId="54378CF9" ns2:textId="77777777">
+          <w:p>
             <w:r>
               <w:rPr>
                 <w:b/>
@@ -1567,7 +1463,7 @@
           </w:p>
         </w:tc>
       </w:tr>
-      <w:tr ns2:paraId="5DE6C9F2" ns2:textId="77777777">
+      <w:tr>
         <w:tc>
           <w:tcPr>
             <w:tcW w:w="2800" w:type="dxa"/>
@@ -1585,9 +1481,9 @@
               <w:right w:w="120" w:type="dxa"/>
             </w:tcMar>
           </w:tcPr>
-          <w:p ns2:paraId="1D8670CB" ns2:textId="77777777">
-            <w:r>
-              <w:t xml:space="preserve">Acierto en el diagnóstico de la foto</w:t>
+          <w:p>
+            <w:r>
+              <w:t>Acierto en el diagnóstico de la foto</w:t>
             </w:r>
           </w:p>
         </w:tc>
@@ -1608,9 +1504,9 @@
               <w:right w:w="120" w:type="dxa"/>
             </w:tcMar>
           </w:tcPr>
-          <w:p ns2:paraId="49A1DCB5" ns2:textId="77777777">
-            <w:r>
-              <w:t xml:space="preserve">&gt;= 80%</w:t>
+          <w:p>
+            <w:r>
+              <w:t>&gt;= 80%</w:t>
             </w:r>
           </w:p>
         </w:tc>
@@ -1631,14 +1527,14 @@
               <w:right w:w="120" w:type="dxa"/>
             </w:tcMar>
           </w:tcPr>
-          <w:p ns2:paraId="619CF819" ns2:textId="77777777">
-            <w:r>
-              <w:t xml:space="preserve">El umbral mínimo para que el sistema aporte valor real frente a no usarlo; el resultado obtenido (94,7%) lo supera ampliamente.</w:t>
+          <w:p>
+            <w:r>
+              <w:t>El umbral mínimo para que el sistema aporte valor real frente a no usarlo; el resultado obtenido (94,7%) lo supera ampliamente.</w:t>
             </w:r>
           </w:p>
         </w:tc>
       </w:tr>
-      <w:tr ns2:paraId="5DE6C9F2" ns2:textId="77777777">
+      <w:tr>
         <w:tc>
           <w:tcPr>
             <w:tcW w:w="2800" w:type="dxa"/>
@@ -1656,9 +1552,9 @@
               <w:right w:w="120" w:type="dxa"/>
             </w:tcMar>
           </w:tcPr>
-          <w:p ns2:paraId="1D8670CB" ns2:textId="77777777">
-            <w:r>
-              <w:t xml:space="preserve">Equilibrio entre plagas frecuentes y poco frecuentes (F1 macro)</w:t>
+          <w:p>
+            <w:r>
+              <w:t>Equilibrio entre plagas frecuentes y poco frecuentes (F1 macro)</w:t>
             </w:r>
           </w:p>
         </w:tc>
@@ -1679,9 +1575,9 @@
               <w:right w:w="120" w:type="dxa"/>
             </w:tcMar>
           </w:tcPr>
-          <w:p ns2:paraId="49A1DCB5" ns2:textId="77777777">
-            <w:r>
-              <w:t xml:space="preserve">&gt;= 85%</w:t>
+          <w:p>
+            <w:r>
+              <w:t>&gt;= 85%</w:t>
             </w:r>
           </w:p>
         </w:tc>
@@ -1702,14 +1598,14 @@
               <w:right w:w="120" w:type="dxa"/>
             </w:tcMar>
           </w:tcPr>
-          <w:p ns2:paraId="619CF819" ns2:textId="77777777">
-            <w:r>
-              <w:t xml:space="preserve">Evita que el sistema solo funcione bien con las plagas más comunes y falle sistemáticamente con las raras; se alcanza un 88%, por encima del umbral, aunque con margen de mejora en las clases menos representadas.</w:t>
+          <w:p>
+            <w:r>
+              <w:t>Evita que el sistema solo funcione bien con las plagas más comunes y falle sistemáticamente con las raras; se alcanza un 88%, por encima del umbral, aunque con margen de mejora en las clases menos representadas.</w:t>
             </w:r>
           </w:p>
         </w:tc>
       </w:tr>
-      <w:tr ns2:paraId="5DE6C9F2" ns2:textId="77777777">
+      <w:tr>
         <w:tc>
           <w:tcPr>
             <w:tcW w:w="2800" w:type="dxa"/>
@@ -1727,9 +1623,9 @@
               <w:right w:w="120" w:type="dxa"/>
             </w:tcMar>
           </w:tcPr>
-          <w:p ns2:paraId="1D8670CB" ns2:textId="77777777">
-            <w:r>
-              <w:t xml:space="preserve">Detección de casos reales (sensibilidad)</w:t>
+          <w:p>
+            <w:r>
+              <w:t>Detección de casos reales (sensibilidad)</w:t>
             </w:r>
           </w:p>
         </w:tc>
@@ -1750,9 +1646,9 @@
               <w:right w:w="120" w:type="dxa"/>
             </w:tcMar>
           </w:tcPr>
-          <w:p ns2:paraId="49A1DCB5" ns2:textId="77777777">
-            <w:r>
-              <w:t xml:space="preserve">&gt;= 85%</w:t>
+          <w:p>
+            <w:r>
+              <w:t>&gt;= 85%</w:t>
             </w:r>
           </w:p>
         </w:tc>
@@ -1773,21 +1669,21 @@
               <w:right w:w="120" w:type="dxa"/>
             </w:tcMar>
           </w:tcPr>
-          <w:p ns2:paraId="619CF819" ns2:textId="77777777">
-            <w:r>
-              <w:t xml:space="preserve">Prioriza no dejar pasar infecciones reales (falsos negativos) frente a dar alguna alarma de más.</w:t>
+          <w:p>
+            <w:r>
+              <w:t>Prioriza no dejar pasar infecciones reales (falsos negativos) frente a dar alguna alarma de más.</w:t>
             </w:r>
           </w:p>
         </w:tc>
       </w:tr>
     </w:tbl>
-    <w:p ns2:paraId="45F4C421" ns2:textId="79EF27F4">
+    <w:p>
       <w:pPr>
-        <w:pStyle w:val="Descripcin"/>
+        <w:pStyle w:val="Caption"/>
         <w:jc w:val="center"/>
       </w:pPr>
-      <w:bookmarkStart w:id="19" w:name="_Toc233977248"/>
-      <w:bookmarkStart w:id="20" w:name="_Toc233977286"/>
+      <w:bookmarkStart w:id="15" w:name="_Toc233977248"/>
+      <w:bookmarkStart w:id="16" w:name="_Toc233977286"/>
       <w:r>
         <w:t xml:space="preserve">Tabla </w:t>
       </w:r>
@@ -1802,20 +1698,20 @@
       <w:r>
         <w:t xml:space="preserve"> KPIs del modelo</w:t>
       </w:r>
-      <w:bookmarkEnd w:id="19"/>
-      <w:bookmarkEnd w:id="20"/>
+      <w:bookmarkEnd w:id="15"/>
+      <w:bookmarkEnd w:id="16"/>
     </w:p>
-    <w:p ns2:paraId="5A151328" ns2:textId="77777777">
+    <w:p>
       <w:pPr>
-        <w:pStyle w:val="Ttulo1"/>
+        <w:pStyle w:val="Heading1"/>
         <w:jc w:val="left"/>
       </w:pPr>
-      <w:bookmarkStart w:id="21" w:name="_Toc233976917"/>
+      <w:bookmarkStart w:id="17" w:name="_Toc233976917"/>
       <w:r>
         <w:lastRenderedPageBreak/>
         <w:t>9. Limitaciones conocidas</w:t>
       </w:r>
-      <w:bookmarkEnd w:id="21"/>
+      <w:bookmarkEnd w:id="17"/>
     </w:p>
     <w:tbl>
       <w:tblPr>
@@ -1836,7 +1732,7 @@
         <w:gridCol w:w="3120"/>
         <w:gridCol w:w="6240"/>
       </w:tblGrid>
-      <w:tr ns2:paraId="1F18AF22" ns2:textId="77777777">
+      <w:tr>
         <w:trPr>
           <w:tblHeader/>
         </w:trPr>
@@ -1857,7 +1753,7 @@
               <w:right w:w="120" w:type="dxa"/>
             </w:tcMar>
           </w:tcPr>
-          <w:p ns2:paraId="758CD852" ns2:textId="77777777">
+          <w:p>
             <w:r>
               <w:rPr>
                 <w:b/>
@@ -1887,7 +1783,7 @@
               <w:right w:w="120" w:type="dxa"/>
             </w:tcMar>
           </w:tcPr>
-          <w:p ns2:paraId="3753A61E" ns2:textId="77777777">
+          <w:p>
             <w:r>
               <w:rPr>
                 <w:b/>
@@ -1901,7 +1797,7 @@
           </w:p>
         </w:tc>
       </w:tr>
-      <w:tr ns2:paraId="51FCD1DF" ns2:textId="77777777">
+      <w:tr>
         <w:tc>
           <w:tcPr>
             <w:tcW w:w="3120" w:type="dxa"/>
@@ -1919,9 +1815,9 @@
               <w:right w:w="120" w:type="dxa"/>
             </w:tcMar>
           </w:tcPr>
-          <w:p ns2:paraId="4308B354" ns2:textId="77777777">
-            <w:r>
-              <w:t xml:space="preserve">Fotos de otros países</w:t>
+          <w:p>
+            <w:r>
+              <w:t>Fotos de otros países</w:t>
             </w:r>
           </w:p>
         </w:tc>
@@ -1942,14 +1838,14 @@
               <w:right w:w="120" w:type="dxa"/>
             </w:tcMar>
           </w:tcPr>
-          <w:p ns2:paraId="3FD46393" ns2:textId="77777777">
-            <w:r>
-              <w:t xml:space="preserve">Al no existir suficientes fotos de viñedos de Castilla y León, se usaron fotos de India, Brasil y EE.UU. Una hoja real de la zona podría presentar síntomas ligeramente distintos a los que el sistema ha visto durante el entrenamiento.</w:t>
+          <w:p>
+            <w:r>
+              <w:t>Al no existir suficientes fotos de viñedos de Castilla y León, se usaron fotos de India, Brasil y EE.UU. Una hoja real de la zona podría presentar síntomas ligeramente distintos a los que el sistema ha visto durante el entrenamiento.</w:t>
             </w:r>
           </w:p>
         </w:tc>
       </w:tr>
-      <w:tr ns2:paraId="51FCD1DF" ns2:textId="77777777">
+      <w:tr>
         <w:tc>
           <w:tcPr>
             <w:tcW w:w="3120" w:type="dxa"/>
@@ -1967,9 +1863,9 @@
               <w:right w:w="120" w:type="dxa"/>
             </w:tcMar>
           </w:tcPr>
-          <w:p ns2:paraId="4308B354" ns2:textId="77777777">
-            <w:r>
-              <w:t xml:space="preserve">Menos fiable con plagas poco comunes</w:t>
+          <w:p>
+            <w:r>
+              <w:t>Menos fiable con plagas poco comunes</w:t>
             </w:r>
           </w:p>
         </w:tc>
@@ -1990,14 +1886,14 @@
               <w:right w:w="120" w:type="dxa"/>
             </w:tcMar>
           </w:tcPr>
-          <w:p ns2:paraId="3FD46393" ns2:textId="77777777">
-            <w:r>
-              <w:t xml:space="preserve">Lobesia, Oídio en racimo y mosquito verde (Empoasca) tienen menos fotos de ejemplo que el resto, y el sistema acierta algo menos con ellas.</w:t>
+          <w:p>
+            <w:r>
+              <w:t>Lobesia, Oídio en racimo y mosquito verde (Empoasca) tienen menos fotos de ejemplo que el resto, y el sistema acierta algo menos con ellas.</w:t>
             </w:r>
           </w:p>
         </w:tc>
       </w:tr>
-      <w:tr ns2:paraId="51FCD1DF" ns2:textId="77777777">
+      <w:tr>
         <w:tc>
           <w:tcPr>
             <w:tcW w:w="3120" w:type="dxa"/>
@@ -2015,9 +1911,9 @@
               <w:right w:w="120" w:type="dxa"/>
             </w:tcMar>
           </w:tcPr>
-          <w:p ns2:paraId="4308B354" ns2:textId="77777777">
-            <w:r>
-              <w:t xml:space="preserve">Sin foto, no hay diagnóstico de plaga</w:t>
+          <w:p>
+            <w:r>
+              <w:t>Sin foto, no hay diagnóstico de plaga</w:t>
             </w:r>
           </w:p>
         </w:tc>
@@ -2038,14 +1934,14 @@
               <w:right w:w="120" w:type="dxa"/>
             </w:tcMar>
           </w:tcPr>
-          <w:p ns2:paraId="3FD46393" ns2:textId="77777777">
-            <w:r>
-              <w:t xml:space="preserve">Si solo mandas los sensores, el sistema te da el riesgo ambiental pero no te dice si hay una plaga presente — para eso necesita la foto.</w:t>
+          <w:p>
+            <w:r>
+              <w:t>Si solo mandas los sensores, el sistema te da el riesgo ambiental pero no te dice si hay una plaga presente — para eso necesita la foto.</w:t>
             </w:r>
           </w:p>
         </w:tc>
       </w:tr>
-      <w:tr ns2:paraId="51FCD1DF" ns2:textId="77777777">
+      <w:tr>
         <w:tc>
           <w:tcPr>
             <w:tcW w:w="3120" w:type="dxa"/>
@@ -2063,9 +1959,9 @@
               <w:right w:w="120" w:type="dxa"/>
             </w:tcMar>
           </w:tcPr>
-          <w:p ns2:paraId="4308B354" ns2:textId="77777777">
-            <w:r>
-              <w:t xml:space="preserve">El índice de riesgo es solo orientativo</w:t>
+          <w:p>
+            <w:r>
+              <w:t>El índice de riesgo es solo orientativo</w:t>
             </w:r>
           </w:p>
         </w:tc>
@@ -2086,14 +1982,14 @@
               <w:right w:w="120" w:type="dxa"/>
             </w:tcMar>
           </w:tcPr>
-          <w:p ns2:paraId="3FD46393" ns2:textId="77777777">
-            <w:r>
-              <w:t xml:space="preserve">En las pruebas, el índice de riesgo apenas acierta más que dar siempre el mismo valor medio: los datos con que se entrenó no relacionan bien las condiciones de los sensores con cada plaga. Úsalo como referencia general, nunca como único criterio.</w:t>
+          <w:p>
+            <w:r>
+              <w:t>En las pruebas, el índice de riesgo apenas acierta más que dar siempre el mismo valor medio: los datos con que se entrenó no relacionan bien las condiciones de los sensores con cada plaga. Úsalo como referencia general, nunca como único criterio.</w:t>
             </w:r>
           </w:p>
         </w:tc>
       </w:tr>
-      <w:tr ns2:paraId="51FCD1DF" ns2:textId="77777777">
+      <w:tr>
         <w:tc>
           <w:tcPr>
             <w:tcW w:w="3120" w:type="dxa"/>
@@ -2111,9 +2007,9 @@
               <w:right w:w="120" w:type="dxa"/>
             </w:tcMar>
           </w:tcPr>
-          <w:p ns2:paraId="4308B354" ns2:textId="77777777">
-            <w:r>
-              <w:t xml:space="preserve">El riesgo ambiental viene de un gemelo digital, no de mediciones de campo acumuladas durante años</w:t>
+          <w:p>
+            <w:r>
+              <w:t>El riesgo ambiental viene de un gemelo digital, no de mediciones de campo acumuladas durante años</w:t>
             </w:r>
           </w:p>
         </w:tc>
@@ -2134,14 +2030,14 @@
               <w:right w:w="120" w:type="dxa"/>
             </w:tcMar>
           </w:tcPr>
-          <w:p ns2:paraId="3FD46393" ns2:textId="77777777">
-            <w:r>
-              <w:t xml:space="preserve">Los datos históricos usados para calibrar el índice de riesgo se generaron con modelos científicos estándar del sector, no son un histórico real de campo de varios años — es razonable como orientación, pero conviene contrastarlo con la experiencia local antes de tomarlo como un valor absoluto.</w:t>
+          <w:p>
+            <w:r>
+              <w:t>Los datos históricos usados para calibrar el índice de riesgo se generaron con modelos científicos estándar del sector, no son un histórico real de campo de varios años — es razonable como orientación, pero conviene contrastarlo con la experiencia local antes de tomarlo como un valor absoluto.</w:t>
             </w:r>
           </w:p>
         </w:tc>
       </w:tr>
-      <w:tr ns2:paraId="51FCD1DF" ns2:textId="77777777">
+      <w:tr>
         <w:tc>
           <w:tcPr>
             <w:tcW w:w="3120" w:type="dxa"/>
@@ -2159,9 +2055,9 @@
               <w:right w:w="120" w:type="dxa"/>
             </w:tcMar>
           </w:tcPr>
-          <w:p ns2:paraId="4308B354" ns2:textId="77777777">
-            <w:r>
-              <w:t xml:space="preserve">El reentrenamiento de la parte visual (fotos) no está disponible todavía</w:t>
+          <w:p>
+            <w:r>
+              <w:t>El reentrenamiento de la parte visual (fotos) no está disponible todavía</w:t>
             </w:r>
           </w:p>
         </w:tc>
@@ -2182,21 +2078,21 @@
               <w:right w:w="120" w:type="dxa"/>
             </w:tcMar>
           </w:tcPr>
-          <w:p ns2:paraId="3FD46393" ns2:textId="77777777">
-            <w:r>
-              <w:t xml:space="preserve">Hoy solo se puede reentrenar la parte que calcula el riesgo a partir de los sensores. Mejorar el reconocimiento de las fotos con datos propios de la explotación requiere un desarrollo específico pendiente.</w:t>
+          <w:p>
+            <w:r>
+              <w:t>Hoy solo se puede reentrenar la parte que calcula el riesgo a partir de los sensores. Mejorar el reconocimiento de las fotos con datos propios de la explotación requiere un desarrollo específico pendiente.</w:t>
             </w:r>
           </w:p>
         </w:tc>
       </w:tr>
     </w:tbl>
-    <w:p ns2:paraId="1FA4B2C9" ns2:textId="4B35F67D">
+    <w:p>
       <w:pPr>
-        <w:pStyle w:val="Descripcin"/>
+        <w:pStyle w:val="Caption"/>
         <w:jc w:val="center"/>
       </w:pPr>
-      <w:bookmarkStart w:id="22" w:name="_Toc233977249"/>
-      <w:bookmarkStart w:id="23" w:name="_Toc233977287"/>
+      <w:bookmarkStart w:id="18" w:name="_Toc233977249"/>
+      <w:bookmarkStart w:id="19" w:name="_Toc233977287"/>
       <w:r>
         <w:t xml:space="preserve">Tabla </w:t>
       </w:r>
@@ -2211,18 +2107,18 @@
       <w:r>
         <w:t xml:space="preserve"> Limitaciones conocidas</w:t>
       </w:r>
-      <w:bookmarkEnd w:id="22"/>
-      <w:bookmarkEnd w:id="23"/>
+      <w:bookmarkEnd w:id="18"/>
+      <w:bookmarkEnd w:id="19"/>
     </w:p>
-    <w:p ns2:paraId="0C6B9E4B" ns2:textId="77777777">
+    <w:p>
       <w:pPr>
         <w:rPr>
           <w:rFonts w:ascii="Liberation sans narrow regular" w:eastAsia="Liberation sans narrow regular" w:hAnsi="Liberation sans narrow regular" w:cs="Liberation sans narrow regular"/>
         </w:rPr>
       </w:pPr>
     </w:p>
-    <w:p ns2:paraId="17A44B7C" ns2:textId="77777777"/>
-    <w:p ns2:paraId="14F09C48" ns2:textId="77777777">
+    <w:p/>
+    <w:p>
       <w:pPr>
         <w:tabs>
           <w:tab w:val="left" w:pos="-142"/>
@@ -2234,10 +2130,10 @@
       </w:pPr>
     </w:p>
     <w:sectPr>
-      <w:headerReference w:type="even" ns7:id="rId12"/>
-      <w:headerReference w:type="default" ns7:id="rId13"/>
-      <w:footerReference w:type="default" ns7:id="rId14"/>
-      <w:footerReference w:type="first" ns7:id="rId15"/>
+      <w:headerReference w:type="even" r:id="rId12"/>
+      <w:headerReference w:type="default" r:id="rId13"/>
+      <w:footerReference w:type="default" r:id="rId14"/>
+      <w:footerReference w:type="first" r:id="rId15"/>
       <w:pgSz w:w="11906" w:h="16838"/>
       <w:pgMar w:top="1417" w:right="1701" w:bottom="1417" w:left="1701" w:header="708" w:footer="708" w:gutter="0"/>
       <w:pgNumType w:start="1"/>
@@ -2990,7 +2886,7 @@
         <w:noProof/>
         <w:color w:val="000000"/>
       </w:rPr>
-      <w:t xml:space="preserve">2</w:t>
+      <w:t>2</w:t>
     </w:r>
     <w:r>
       <w:rPr>
@@ -3004,23 +2900,7 @@
         <w:rFonts w:ascii="Liberalisation sans narrow" w:eastAsia="Liberalisation sans narrow" w:hAnsi="Liberalisation sans narrow" w:cs="Liberalisation sans narrow"/>
         <w:color w:val="000000"/>
       </w:rPr>
-      <w:t xml:space="preserve"> |Ficha funcional – Modelo a01 (</w:t>
-    </w:r>
-    <w:proofErr w:type="spellStart"/>
-    <w:r>
-      <w:rPr>
-        <w:rFonts w:ascii="Liberalisation sans narrow" w:eastAsia="Liberalisation sans narrow" w:hAnsi="Liberalisation sans narrow" w:cs="Liberalisation sans narrow"/>
-        <w:color w:val="000000"/>
-      </w:rPr>
-      <w:t xml:space="preserve">wine-pest-disease-detection</w:t>
-    </w:r>
-    <w:proofErr w:type="spellEnd"/>
-    <w:r>
-      <w:rPr>
-        <w:rFonts w:ascii="Liberalisation sans narrow" w:eastAsia="Liberalisation sans narrow" w:hAnsi="Liberalisation sans narrow" w:cs="Liberalisation sans narrow"/>
-        <w:color w:val="000000"/>
-      </w:rPr>
-      <w:t>)</w:t>
+      <w:t xml:space="preserve"> |Ficha funcional – Modelo a01 (wine-pest-disease-detection)</w:t>
     </w:r>
   </w:p>
   <w:p>
@@ -3568,11 +3448,11 @@
     <w:name w:val="Normal"/>
     <w:qFormat/>
   </w:style>
-  <w:style w:type="paragraph" w:styleId="Ttulo1">
+  <w:style w:type="paragraph" w:styleId="Heading1">
     <w:name w:val="heading 1"/>
     <w:basedOn w:val="Normal"/>
     <w:next w:val="Normal"/>
-    <w:link w:val="Ttulo1Car"/>
+    <w:link w:val="Heading1Char"/>
     <w:uiPriority w:val="9"/>
     <w:qFormat/>
     <w:pPr>
@@ -3590,11 +3470,11 @@
       <w:szCs w:val="36"/>
     </w:rPr>
   </w:style>
-  <w:style w:type="paragraph" w:styleId="Ttulo2">
+  <w:style w:type="paragraph" w:styleId="Heading2">
     <w:name w:val="heading 2"/>
     <w:basedOn w:val="Normal"/>
     <w:next w:val="Normal"/>
-    <w:link w:val="Ttulo2Car"/>
+    <w:link w:val="Heading2Char"/>
     <w:uiPriority w:val="9"/>
     <w:semiHidden/>
     <w:unhideWhenUsed/>
@@ -3613,11 +3493,11 @@
       <w:szCs w:val="32"/>
     </w:rPr>
   </w:style>
-  <w:style w:type="paragraph" w:styleId="Ttulo3">
+  <w:style w:type="paragraph" w:styleId="Heading3">
     <w:name w:val="heading 3"/>
     <w:basedOn w:val="Normal"/>
     <w:next w:val="Normal"/>
-    <w:link w:val="Ttulo3Car"/>
+    <w:link w:val="Heading3Char"/>
     <w:uiPriority w:val="9"/>
     <w:semiHidden/>
     <w:unhideWhenUsed/>
@@ -3636,11 +3516,11 @@
       <w:szCs w:val="28"/>
     </w:rPr>
   </w:style>
-  <w:style w:type="paragraph" w:styleId="Ttulo4">
+  <w:style w:type="paragraph" w:styleId="Heading4">
     <w:name w:val="heading 4"/>
     <w:basedOn w:val="Normal"/>
     <w:next w:val="Normal"/>
-    <w:link w:val="Ttulo4Car"/>
+    <w:link w:val="Heading4Char"/>
     <w:uiPriority w:val="9"/>
     <w:semiHidden/>
     <w:unhideWhenUsed/>
@@ -3659,11 +3539,11 @@
       <w:szCs w:val="24"/>
     </w:rPr>
   </w:style>
-  <w:style w:type="paragraph" w:styleId="Ttulo5">
+  <w:style w:type="paragraph" w:styleId="Heading5">
     <w:name w:val="heading 5"/>
     <w:basedOn w:val="Normal"/>
     <w:next w:val="Normal"/>
-    <w:link w:val="Ttulo5Car"/>
+    <w:link w:val="Heading5Char"/>
     <w:uiPriority w:val="9"/>
     <w:semiHidden/>
     <w:unhideWhenUsed/>
@@ -3681,11 +3561,11 @@
       <w:color w:val="284546"/>
     </w:rPr>
   </w:style>
-  <w:style w:type="paragraph" w:styleId="Ttulo6">
+  <w:style w:type="paragraph" w:styleId="Heading6">
     <w:name w:val="heading 6"/>
     <w:basedOn w:val="Normal"/>
     <w:next w:val="Normal"/>
-    <w:link w:val="Ttulo6Car"/>
+    <w:link w:val="Heading6Char"/>
     <w:uiPriority w:val="9"/>
     <w:semiHidden/>
     <w:unhideWhenUsed/>
@@ -3705,11 +3585,11 @@
       <w:color w:val="1B2E2F"/>
     </w:rPr>
   </w:style>
-  <w:style w:type="paragraph" w:styleId="Ttulo7">
+  <w:style w:type="paragraph" w:styleId="Heading7">
     <w:name w:val="heading 7"/>
     <w:basedOn w:val="Normal"/>
     <w:next w:val="Normal"/>
-    <w:link w:val="Ttulo7Car"/>
+    <w:link w:val="Heading7Char"/>
     <w:uiPriority w:val="9"/>
     <w:unhideWhenUsed/>
     <w:qFormat/>
@@ -3727,11 +3607,11 @@
       <w:color w:val="1B2E2E" w:themeColor="accent1" w:themeShade="80"/>
     </w:rPr>
   </w:style>
-  <w:style w:type="paragraph" w:styleId="Ttulo8">
+  <w:style w:type="paragraph" w:styleId="Heading8">
     <w:name w:val="heading 8"/>
     <w:basedOn w:val="Normal"/>
     <w:next w:val="Normal"/>
-    <w:link w:val="Ttulo8Car"/>
+    <w:link w:val="Heading8Char"/>
     <w:uiPriority w:val="9"/>
     <w:unhideWhenUsed/>
     <w:qFormat/>
@@ -3751,11 +3631,11 @@
       <w:color w:val="1B2E2E" w:themeColor="accent1" w:themeShade="80"/>
     </w:rPr>
   </w:style>
-  <w:style w:type="paragraph" w:styleId="Ttulo9">
+  <w:style w:type="paragraph" w:styleId="Heading9">
     <w:name w:val="heading 9"/>
     <w:basedOn w:val="Normal"/>
     <w:next w:val="Normal"/>
-    <w:link w:val="Ttulo9Car"/>
+    <w:link w:val="Heading9Char"/>
     <w:uiPriority w:val="9"/>
     <w:semiHidden/>
     <w:unhideWhenUsed/>
@@ -3774,13 +3654,13 @@
       <w:color w:val="1B2E2E" w:themeColor="accent1" w:themeShade="80"/>
     </w:rPr>
   </w:style>
-  <w:style w:type="character" w:default="1" w:styleId="Fuentedeprrafopredeter">
+  <w:style w:type="character" w:default="1" w:styleId="DefaultParagraphFont">
     <w:name w:val="Default Paragraph Font"/>
     <w:uiPriority w:val="1"/>
     <w:semiHidden/>
     <w:unhideWhenUsed/>
   </w:style>
-  <w:style w:type="table" w:default="1" w:styleId="Tablanormal">
+  <w:style w:type="table" w:default="1" w:styleId="TableNormal">
     <w:name w:val="Normal Table"/>
     <w:uiPriority w:val="99"/>
     <w:semiHidden/>
@@ -3795,13 +3675,13 @@
       </w:tblCellMar>
     </w:tblPr>
   </w:style>
-  <w:style w:type="numbering" w:default="1" w:styleId="Sinlista">
+  <w:style w:type="numbering" w:default="1" w:styleId="NoList">
     <w:name w:val="No List"/>
     <w:uiPriority w:val="99"/>
     <w:semiHidden/>
     <w:unhideWhenUsed/>
   </w:style>
-  <w:style w:type="table" w:customStyle="1" w:styleId="TableNormal">
+  <w:style w:type="table" w:customStyle="1" w:styleId="TableNormal0">
     <w:name w:val="TableNormal"/>
     <w:tblPr>
       <w:tblCellMar>
@@ -3812,11 +3692,11 @@
       </w:tblCellMar>
     </w:tblPr>
   </w:style>
-  <w:style w:type="paragraph" w:styleId="Ttulo">
+  <w:style w:type="paragraph" w:styleId="Title">
     <w:name w:val="Title"/>
     <w:basedOn w:val="Normal"/>
     <w:next w:val="Normal"/>
-    <w:link w:val="TtuloCar"/>
+    <w:link w:val="TitleChar"/>
     <w:uiPriority w:val="10"/>
     <w:qFormat/>
     <w:pPr>
@@ -3831,10 +3711,10 @@
       <w:szCs w:val="72"/>
     </w:rPr>
   </w:style>
-  <w:style w:type="character" w:customStyle="1" w:styleId="Ttulo1Car">
-    <w:name w:val="Título 1 Car"/>
-    <w:basedOn w:val="Fuentedeprrafopredeter"/>
-    <w:link w:val="Ttulo1"/>
+  <w:style w:type="character" w:customStyle="1" w:styleId="Heading1Char">
+    <w:name w:val="Heading 1 Char"/>
+    <w:basedOn w:val="DefaultParagraphFont"/>
+    <w:link w:val="Heading1"/>
     <w:uiPriority w:val="9"/>
     <w:rsid w:val="00AB39A2"/>
     <w:rPr>
@@ -3844,10 +3724,10 @@
       <w:szCs w:val="36"/>
     </w:rPr>
   </w:style>
-  <w:style w:type="character" w:customStyle="1" w:styleId="Ttulo2Car">
-    <w:name w:val="Título 2 Car"/>
-    <w:basedOn w:val="Fuentedeprrafopredeter"/>
-    <w:link w:val="Ttulo2"/>
+  <w:style w:type="character" w:customStyle="1" w:styleId="Heading2Char">
+    <w:name w:val="Heading 2 Char"/>
+    <w:basedOn w:val="DefaultParagraphFont"/>
+    <w:link w:val="Heading2"/>
     <w:uiPriority w:val="9"/>
     <w:rsid w:val="00AB39A2"/>
     <w:rPr>
@@ -3857,10 +3737,10 @@
       <w:szCs w:val="32"/>
     </w:rPr>
   </w:style>
-  <w:style w:type="character" w:customStyle="1" w:styleId="Ttulo3Car">
-    <w:name w:val="Título 3 Car"/>
-    <w:basedOn w:val="Fuentedeprrafopredeter"/>
-    <w:link w:val="Ttulo3"/>
+  <w:style w:type="character" w:customStyle="1" w:styleId="Heading3Char">
+    <w:name w:val="Heading 3 Char"/>
+    <w:basedOn w:val="DefaultParagraphFont"/>
+    <w:link w:val="Heading3"/>
     <w:uiPriority w:val="9"/>
     <w:rsid w:val="00AB39A2"/>
     <w:rPr>
@@ -3870,10 +3750,10 @@
       <w:szCs w:val="28"/>
     </w:rPr>
   </w:style>
-  <w:style w:type="character" w:customStyle="1" w:styleId="Ttulo4Car">
-    <w:name w:val="Título 4 Car"/>
-    <w:basedOn w:val="Fuentedeprrafopredeter"/>
-    <w:link w:val="Ttulo4"/>
+  <w:style w:type="character" w:customStyle="1" w:styleId="Heading4Char">
+    <w:name w:val="Heading 4 Char"/>
+    <w:basedOn w:val="DefaultParagraphFont"/>
+    <w:link w:val="Heading4"/>
     <w:uiPriority w:val="9"/>
     <w:rsid w:val="00AB39A2"/>
     <w:rPr>
@@ -3883,10 +3763,10 @@
       <w:szCs w:val="24"/>
     </w:rPr>
   </w:style>
-  <w:style w:type="character" w:customStyle="1" w:styleId="Ttulo5Car">
-    <w:name w:val="Título 5 Car"/>
-    <w:basedOn w:val="Fuentedeprrafopredeter"/>
-    <w:link w:val="Ttulo5"/>
+  <w:style w:type="character" w:customStyle="1" w:styleId="Heading5Char">
+    <w:name w:val="Heading 5 Char"/>
+    <w:basedOn w:val="DefaultParagraphFont"/>
+    <w:link w:val="Heading5"/>
     <w:uiPriority w:val="9"/>
     <w:rsid w:val="00AB39A2"/>
     <w:rPr>
@@ -3895,10 +3775,10 @@
       <w:color w:val="284546" w:themeColor="accent1" w:themeShade="BF"/>
     </w:rPr>
   </w:style>
-  <w:style w:type="character" w:customStyle="1" w:styleId="Ttulo6Car">
-    <w:name w:val="Título 6 Car"/>
-    <w:basedOn w:val="Fuentedeprrafopredeter"/>
-    <w:link w:val="Ttulo6"/>
+  <w:style w:type="character" w:customStyle="1" w:styleId="Heading6Char">
+    <w:name w:val="Heading 6 Char"/>
+    <w:basedOn w:val="DefaultParagraphFont"/>
+    <w:link w:val="Heading6"/>
     <w:uiPriority w:val="9"/>
     <w:rsid w:val="00AB39A2"/>
     <w:rPr>
@@ -3909,10 +3789,10 @@
       <w:color w:val="1B2E2E" w:themeColor="accent1" w:themeShade="80"/>
     </w:rPr>
   </w:style>
-  <w:style w:type="character" w:customStyle="1" w:styleId="Ttulo7Car">
-    <w:name w:val="Título 7 Car"/>
-    <w:basedOn w:val="Fuentedeprrafopredeter"/>
-    <w:link w:val="Ttulo7"/>
+  <w:style w:type="character" w:customStyle="1" w:styleId="Heading7Char">
+    <w:name w:val="Heading 7 Char"/>
+    <w:basedOn w:val="DefaultParagraphFont"/>
+    <w:link w:val="Heading7"/>
     <w:uiPriority w:val="9"/>
     <w:rsid w:val="00AB39A2"/>
     <w:rPr>
@@ -3922,10 +3802,10 @@
       <w:color w:val="1B2E2E" w:themeColor="accent1" w:themeShade="80"/>
     </w:rPr>
   </w:style>
-  <w:style w:type="character" w:customStyle="1" w:styleId="Ttulo8Car">
-    <w:name w:val="Título 8 Car"/>
-    <w:basedOn w:val="Fuentedeprrafopredeter"/>
-    <w:link w:val="Ttulo8"/>
+  <w:style w:type="character" w:customStyle="1" w:styleId="Heading8Char">
+    <w:name w:val="Heading 8 Char"/>
+    <w:basedOn w:val="DefaultParagraphFont"/>
+    <w:link w:val="Heading8"/>
     <w:uiPriority w:val="9"/>
     <w:rsid w:val="00AB39A2"/>
     <w:rPr>
@@ -3937,10 +3817,10 @@
       <w:color w:val="1B2E2E" w:themeColor="accent1" w:themeShade="80"/>
     </w:rPr>
   </w:style>
-  <w:style w:type="character" w:customStyle="1" w:styleId="Ttulo9Car">
-    <w:name w:val="Título 9 Car"/>
-    <w:basedOn w:val="Fuentedeprrafopredeter"/>
-    <w:link w:val="Ttulo9"/>
+  <w:style w:type="character" w:customStyle="1" w:styleId="Heading9Char">
+    <w:name w:val="Heading 9 Char"/>
+    <w:basedOn w:val="DefaultParagraphFont"/>
+    <w:link w:val="Heading9"/>
     <w:uiPriority w:val="9"/>
     <w:semiHidden/>
     <w:rsid w:val="00AB39A2"/>
@@ -3951,11 +3831,11 @@
       <w:color w:val="1B2E2E" w:themeColor="accent1" w:themeShade="80"/>
     </w:rPr>
   </w:style>
-  <w:style w:type="paragraph" w:styleId="Descripcin">
+  <w:style w:type="paragraph" w:styleId="Caption">
     <w:name w:val="caption"/>
     <w:basedOn w:val="Normal"/>
     <w:next w:val="Normal"/>
-    <w:link w:val="DescripcinCar"/>
+    <w:link w:val="CaptionChar"/>
     <w:unhideWhenUsed/>
     <w:qFormat/>
     <w:rsid w:val="00AB39A2"/>
@@ -3969,10 +3849,10 @@
       <w:color w:val="739A8A" w:themeColor="text2"/>
     </w:rPr>
   </w:style>
-  <w:style w:type="character" w:customStyle="1" w:styleId="TtuloCar">
-    <w:name w:val="Título Car"/>
-    <w:basedOn w:val="Fuentedeprrafopredeter"/>
-    <w:link w:val="Ttulo"/>
+  <w:style w:type="character" w:customStyle="1" w:styleId="TitleChar">
+    <w:name w:val="Title Char"/>
+    <w:basedOn w:val="DefaultParagraphFont"/>
+    <w:link w:val="Title"/>
     <w:uiPriority w:val="10"/>
     <w:rsid w:val="00AB39A2"/>
     <w:rPr>
@@ -3984,10 +3864,10 @@
       <w:szCs w:val="72"/>
     </w:rPr>
   </w:style>
-  <w:style w:type="character" w:customStyle="1" w:styleId="SubttuloCar">
-    <w:name w:val="Subtítulo Car"/>
-    <w:basedOn w:val="Fuentedeprrafopredeter"/>
-    <w:link w:val="Subttulo"/>
+  <w:style w:type="character" w:customStyle="1" w:styleId="SubtitleChar">
+    <w:name w:val="Subtitle Char"/>
+    <w:basedOn w:val="DefaultParagraphFont"/>
+    <w:link w:val="Subtitle"/>
     <w:uiPriority w:val="11"/>
     <w:rsid w:val="00AB39A2"/>
     <w:rPr>
@@ -3997,9 +3877,9 @@
       <w:szCs w:val="28"/>
     </w:rPr>
   </w:style>
-  <w:style w:type="character" w:styleId="Fuerte">
+  <w:style w:type="character" w:styleId="Strong">
     <w:name w:val="Strong"/>
-    <w:basedOn w:val="Fuentedeprrafopredeter"/>
+    <w:basedOn w:val="DefaultParagraphFont"/>
     <w:uiPriority w:val="22"/>
     <w:qFormat/>
     <w:rsid w:val="00AB39A2"/>
@@ -4008,9 +3888,9 @@
       <w:bCs/>
     </w:rPr>
   </w:style>
-  <w:style w:type="character" w:styleId="nfasis">
+  <w:style w:type="character" w:styleId="Emphasis">
     <w:name w:val="Emphasis"/>
-    <w:basedOn w:val="Fuentedeprrafopredeter"/>
+    <w:basedOn w:val="DefaultParagraphFont"/>
     <w:uiPriority w:val="20"/>
     <w:qFormat/>
     <w:rsid w:val="00AB39A2"/>
@@ -4019,7 +3899,7 @@
       <w:iCs/>
     </w:rPr>
   </w:style>
-  <w:style w:type="paragraph" w:styleId="Sinespaciado">
+  <w:style w:type="paragraph" w:styleId="NoSpacing">
     <w:name w:val="No Spacing"/>
     <w:uiPriority w:val="1"/>
     <w:qFormat/>
@@ -4028,11 +3908,11 @@
       <w:spacing w:after="0" w:line="240" w:lineRule="auto"/>
     </w:pPr>
   </w:style>
-  <w:style w:type="paragraph" w:styleId="Cita">
+  <w:style w:type="paragraph" w:styleId="Quote">
     <w:name w:val="Quote"/>
     <w:basedOn w:val="Normal"/>
     <w:next w:val="Normal"/>
-    <w:link w:val="CitaCar"/>
+    <w:link w:val="QuoteChar"/>
     <w:uiPriority w:val="29"/>
     <w:qFormat/>
     <w:rsid w:val="00AB39A2"/>
@@ -4046,10 +3926,10 @@
       <w:szCs w:val="24"/>
     </w:rPr>
   </w:style>
-  <w:style w:type="character" w:customStyle="1" w:styleId="CitaCar">
-    <w:name w:val="Cita Car"/>
-    <w:basedOn w:val="Fuentedeprrafopredeter"/>
-    <w:link w:val="Cita"/>
+  <w:style w:type="character" w:customStyle="1" w:styleId="QuoteChar">
+    <w:name w:val="Quote Char"/>
+    <w:basedOn w:val="DefaultParagraphFont"/>
+    <w:link w:val="Quote"/>
     <w:uiPriority w:val="29"/>
     <w:rsid w:val="00AB39A2"/>
     <w:rPr>
@@ -4058,11 +3938,11 @@
       <w:szCs w:val="24"/>
     </w:rPr>
   </w:style>
-  <w:style w:type="paragraph" w:styleId="Citadestacada">
+  <w:style w:type="paragraph" w:styleId="IntenseQuote">
     <w:name w:val="Intense Quote"/>
     <w:basedOn w:val="Normal"/>
     <w:next w:val="Normal"/>
-    <w:link w:val="CitadestacadaCar"/>
+    <w:link w:val="IntenseQuoteChar"/>
     <w:uiPriority w:val="30"/>
     <w:qFormat/>
     <w:rsid w:val="00AB39A2"/>
@@ -4079,10 +3959,10 @@
       <w:szCs w:val="32"/>
     </w:rPr>
   </w:style>
-  <w:style w:type="character" w:customStyle="1" w:styleId="CitadestacadaCar">
-    <w:name w:val="Cita destacada Car"/>
-    <w:basedOn w:val="Fuentedeprrafopredeter"/>
-    <w:link w:val="Citadestacada"/>
+  <w:style w:type="character" w:customStyle="1" w:styleId="IntenseQuoteChar">
+    <w:name w:val="Intense Quote Char"/>
+    <w:basedOn w:val="DefaultParagraphFont"/>
+    <w:link w:val="IntenseQuote"/>
     <w:uiPriority w:val="30"/>
     <w:rsid w:val="00AB39A2"/>
     <w:rPr>
@@ -4093,9 +3973,9 @@
       <w:szCs w:val="32"/>
     </w:rPr>
   </w:style>
-  <w:style w:type="character" w:styleId="nfasissutil">
+  <w:style w:type="character" w:styleId="SubtleEmphasis">
     <w:name w:val="Subtle Emphasis"/>
-    <w:basedOn w:val="Fuentedeprrafopredeter"/>
+    <w:basedOn w:val="DefaultParagraphFont"/>
     <w:uiPriority w:val="19"/>
     <w:qFormat/>
     <w:rsid w:val="00AB39A2"/>
@@ -4105,9 +3985,9 @@
       <w:color w:val="A3BDB2" w:themeColor="text1" w:themeTint="A6"/>
     </w:rPr>
   </w:style>
-  <w:style w:type="character" w:styleId="nfasisintenso">
+  <w:style w:type="character" w:styleId="IntenseEmphasis">
     <w:name w:val="Intense Emphasis"/>
-    <w:basedOn w:val="Fuentedeprrafopredeter"/>
+    <w:basedOn w:val="DefaultParagraphFont"/>
     <w:uiPriority w:val="21"/>
     <w:qFormat/>
     <w:rsid w:val="00AB39A2"/>
@@ -4118,9 +3998,9 @@
       <w:iCs/>
     </w:rPr>
   </w:style>
-  <w:style w:type="character" w:styleId="Referenciasutil">
+  <w:style w:type="character" w:styleId="SubtleReference">
     <w:name w:val="Subtle Reference"/>
-    <w:basedOn w:val="Fuentedeprrafopredeter"/>
+    <w:basedOn w:val="DefaultParagraphFont"/>
     <w:uiPriority w:val="31"/>
     <w:qFormat/>
     <w:rsid w:val="00AB39A2"/>
@@ -4131,9 +4011,9 @@
       <w:bdr w:val="none" w:sz="0" w:space="0" w:color="auto"/>
     </w:rPr>
   </w:style>
-  <w:style w:type="character" w:styleId="Referenciaintensa">
+  <w:style w:type="character" w:styleId="IntenseReference">
     <w:name w:val="Intense Reference"/>
-    <w:basedOn w:val="Fuentedeprrafopredeter"/>
+    <w:basedOn w:val="DefaultParagraphFont"/>
     <w:uiPriority w:val="32"/>
     <w:qFormat/>
     <w:rsid w:val="00AB39A2"/>
@@ -4145,9 +4025,9 @@
       <w:u w:val="single"/>
     </w:rPr>
   </w:style>
-  <w:style w:type="character" w:styleId="Ttulodellibro">
+  <w:style w:type="character" w:styleId="BookTitle">
     <w:name w:val="Book Title"/>
-    <w:basedOn w:val="Fuentedeprrafopredeter"/>
+    <w:basedOn w:val="DefaultParagraphFont"/>
     <w:uiPriority w:val="33"/>
     <w:qFormat/>
     <w:rsid w:val="00AB39A2"/>
@@ -4158,9 +4038,9 @@
       <w:spacing w:val="10"/>
     </w:rPr>
   </w:style>
-  <w:style w:type="paragraph" w:styleId="TtuloTDC">
+  <w:style w:type="paragraph" w:styleId="TOCHeading">
     <w:name w:val="TOC Heading"/>
-    <w:basedOn w:val="Ttulo1"/>
+    <w:basedOn w:val="Heading1"/>
     <w:next w:val="Normal"/>
     <w:uiPriority w:val="39"/>
     <w:unhideWhenUsed/>
@@ -4170,10 +4050,10 @@
       <w:outlineLvl w:val="9"/>
     </w:pPr>
   </w:style>
-  <w:style w:type="paragraph" w:styleId="Encabezado">
+  <w:style w:type="paragraph" w:styleId="Header">
     <w:name w:val="header"/>
     <w:basedOn w:val="Normal"/>
-    <w:link w:val="EncabezadoCar"/>
+    <w:link w:val="HeaderChar"/>
     <w:uiPriority w:val="99"/>
     <w:unhideWhenUsed/>
     <w:rsid w:val="00171F5E"/>
@@ -4185,17 +4065,17 @@
       <w:spacing w:after="0" w:line="240" w:lineRule="auto"/>
     </w:pPr>
   </w:style>
-  <w:style w:type="character" w:customStyle="1" w:styleId="EncabezadoCar">
-    <w:name w:val="Encabezado Car"/>
-    <w:basedOn w:val="Fuentedeprrafopredeter"/>
-    <w:link w:val="Encabezado"/>
+  <w:style w:type="character" w:customStyle="1" w:styleId="HeaderChar">
+    <w:name w:val="Header Char"/>
+    <w:basedOn w:val="DefaultParagraphFont"/>
+    <w:link w:val="Header"/>
     <w:uiPriority w:val="99"/>
     <w:rsid w:val="00171F5E"/>
   </w:style>
-  <w:style w:type="paragraph" w:styleId="Piedepgina">
+  <w:style w:type="paragraph" w:styleId="Footer">
     <w:name w:val="footer"/>
     <w:basedOn w:val="Normal"/>
-    <w:link w:val="PiedepginaCar"/>
+    <w:link w:val="FooterChar"/>
     <w:uiPriority w:val="99"/>
     <w:unhideWhenUsed/>
     <w:rsid w:val="00171F5E"/>
@@ -4207,14 +4087,14 @@
       <w:spacing w:after="0" w:line="240" w:lineRule="auto"/>
     </w:pPr>
   </w:style>
-  <w:style w:type="character" w:customStyle="1" w:styleId="PiedepginaCar">
-    <w:name w:val="Pie de página Car"/>
-    <w:basedOn w:val="Fuentedeprrafopredeter"/>
-    <w:link w:val="Piedepgina"/>
+  <w:style w:type="character" w:customStyle="1" w:styleId="FooterChar">
+    <w:name w:val="Footer Char"/>
+    <w:basedOn w:val="DefaultParagraphFont"/>
+    <w:link w:val="Footer"/>
     <w:uiPriority w:val="99"/>
     <w:rsid w:val="00171F5E"/>
   </w:style>
-  <w:style w:type="paragraph" w:styleId="TDC1">
+  <w:style w:type="paragraph" w:styleId="TOC1">
     <w:name w:val="toc 1"/>
     <w:basedOn w:val="Normal"/>
     <w:next w:val="Normal"/>
@@ -4226,7 +4106,7 @@
       <w:spacing w:after="100"/>
     </w:pPr>
   </w:style>
-  <w:style w:type="paragraph" w:styleId="TDC2">
+  <w:style w:type="paragraph" w:styleId="TOC2">
     <w:name w:val="toc 2"/>
     <w:basedOn w:val="Normal"/>
     <w:next w:val="Normal"/>
@@ -4243,7 +4123,7 @@
       <w:ind w:left="220"/>
     </w:pPr>
   </w:style>
-  <w:style w:type="paragraph" w:styleId="TDC3">
+  <w:style w:type="paragraph" w:styleId="TOC3">
     <w:name w:val="toc 3"/>
     <w:basedOn w:val="Normal"/>
     <w:next w:val="Normal"/>
@@ -4257,10 +4137,10 @@
       <w:ind w:left="440"/>
     </w:pPr>
   </w:style>
-  <w:style w:type="paragraph" w:styleId="Textonotapie">
+  <w:style w:type="paragraph" w:styleId="FootnoteText">
     <w:name w:val="footnote text"/>
     <w:basedOn w:val="Normal"/>
-    <w:link w:val="TextonotapieCar"/>
+    <w:link w:val="FootnoteTextChar"/>
     <w:uiPriority w:val="99"/>
     <w:semiHidden/>
     <w:unhideWhenUsed/>
@@ -4273,10 +4153,10 @@
       <w:szCs w:val="20"/>
     </w:rPr>
   </w:style>
-  <w:style w:type="character" w:customStyle="1" w:styleId="TextonotapieCar">
-    <w:name w:val="Texto nota pie Car"/>
-    <w:basedOn w:val="Fuentedeprrafopredeter"/>
-    <w:link w:val="Textonotapie"/>
+  <w:style w:type="character" w:customStyle="1" w:styleId="FootnoteTextChar">
+    <w:name w:val="Footnote Text Char"/>
+    <w:basedOn w:val="DefaultParagraphFont"/>
+    <w:link w:val="FootnoteText"/>
     <w:uiPriority w:val="99"/>
     <w:semiHidden/>
     <w:rsid w:val="00C81877"/>
@@ -4285,10 +4165,10 @@
       <w:szCs w:val="20"/>
     </w:rPr>
   </w:style>
-  <w:style w:type="paragraph" w:styleId="Textocomentario">
+  <w:style w:type="paragraph" w:styleId="CommentText">
     <w:name w:val="annotation text"/>
     <w:basedOn w:val="Normal"/>
-    <w:link w:val="TextocomentarioCar"/>
+    <w:link w:val="CommentTextChar"/>
     <w:uiPriority w:val="99"/>
     <w:semiHidden/>
     <w:unhideWhenUsed/>
@@ -4305,10 +4185,10 @@
       <w:lang w:val="en-US"/>
     </w:rPr>
   </w:style>
-  <w:style w:type="character" w:customStyle="1" w:styleId="TextocomentarioCar">
-    <w:name w:val="Texto comentario Car"/>
-    <w:basedOn w:val="Fuentedeprrafopredeter"/>
-    <w:link w:val="Textocomentario"/>
+  <w:style w:type="character" w:customStyle="1" w:styleId="CommentTextChar">
+    <w:name w:val="Comment Text Char"/>
+    <w:basedOn w:val="DefaultParagraphFont"/>
+    <w:link w:val="CommentText"/>
     <w:uiPriority w:val="99"/>
     <w:semiHidden/>
     <w:rsid w:val="00C81877"/>
@@ -4319,7 +4199,7 @@
       <w:lang w:val="en-US"/>
     </w:rPr>
   </w:style>
-  <w:style w:type="character" w:styleId="Refdenotaalpie">
+  <w:style w:type="character" w:styleId="FootnoteReference">
     <w:name w:val="footnote reference"/>
     <w:uiPriority w:val="99"/>
     <w:semiHidden/>
@@ -4329,9 +4209,9 @@
       <w:vertAlign w:val="superscript"/>
     </w:rPr>
   </w:style>
-  <w:style w:type="character" w:styleId="Refdecomentario">
+  <w:style w:type="character" w:styleId="CommentReference">
     <w:name w:val="annotation reference"/>
-    <w:basedOn w:val="Fuentedeprrafopredeter"/>
+    <w:basedOn w:val="DefaultParagraphFont"/>
     <w:uiPriority w:val="99"/>
     <w:semiHidden/>
     <w:unhideWhenUsed/>
@@ -4341,9 +4221,9 @@
       <w:szCs w:val="16"/>
     </w:rPr>
   </w:style>
-  <w:style w:type="character" w:styleId="Hipervnculo">
+  <w:style w:type="character" w:styleId="Hyperlink">
     <w:name w:val="Hyperlink"/>
-    <w:basedOn w:val="Fuentedeprrafopredeter"/>
+    <w:basedOn w:val="DefaultParagraphFont"/>
     <w:uiPriority w:val="99"/>
     <w:unhideWhenUsed/>
     <w:rsid w:val="00C81877"/>
@@ -4352,9 +4232,9 @@
       <w:u w:val="single"/>
     </w:rPr>
   </w:style>
-  <w:style w:type="character" w:styleId="Mencinsinresolver">
+  <w:style w:type="character" w:styleId="UnresolvedMention">
     <w:name w:val="Unresolved Mention"/>
-    <w:basedOn w:val="Fuentedeprrafopredeter"/>
+    <w:basedOn w:val="DefaultParagraphFont"/>
     <w:uiPriority w:val="99"/>
     <w:semiHidden/>
     <w:unhideWhenUsed/>
@@ -4364,9 +4244,9 @@
       <w:shd w:val="clear" w:color="auto" w:fill="E1DFDD"/>
     </w:rPr>
   </w:style>
-  <w:style w:type="table" w:styleId="Tablaconcuadrcula">
+  <w:style w:type="table" w:styleId="TableGrid">
     <w:name w:val="Table Grid"/>
-    <w:basedOn w:val="Tablanormal"/>
+    <w:basedOn w:val="TableNormal"/>
     <w:uiPriority w:val="39"/>
     <w:rsid w:val="00292DEB"/>
     <w:pPr>
@@ -4390,7 +4270,7 @@
       </w:tblBorders>
     </w:tblPr>
   </w:style>
-  <w:style w:type="paragraph" w:styleId="Tabladeilustraciones">
+  <w:style w:type="paragraph" w:styleId="TableofFigures">
     <w:name w:val="table of figures"/>
     <w:basedOn w:val="Normal"/>
     <w:next w:val="Normal"/>
@@ -4408,10 +4288,10 @@
       <w:lang w:val="en-US"/>
     </w:rPr>
   </w:style>
-  <w:style w:type="character" w:customStyle="1" w:styleId="DescripcinCar">
-    <w:name w:val="Descripción Car"/>
-    <w:basedOn w:val="Fuentedeprrafopredeter"/>
-    <w:link w:val="Descripcin"/>
+  <w:style w:type="character" w:customStyle="1" w:styleId="CaptionChar">
+    <w:name w:val="Caption Char"/>
+    <w:basedOn w:val="DefaultParagraphFont"/>
+    <w:link w:val="Caption"/>
     <w:locked/>
     <w:rsid w:val="00CE62B2"/>
     <w:rPr>
@@ -4421,11 +4301,11 @@
       <w:color w:val="739A8A" w:themeColor="text2"/>
     </w:rPr>
   </w:style>
-  <w:style w:type="paragraph" w:styleId="Subttulo">
+  <w:style w:type="paragraph" w:styleId="Subtitle">
     <w:name w:val="Subtitle"/>
     <w:basedOn w:val="Normal"/>
     <w:next w:val="Normal"/>
-    <w:link w:val="SubttuloCar"/>
+    <w:link w:val="SubtitleChar"/>
     <w:uiPriority w:val="11"/>
     <w:qFormat/>
     <w:pPr>
@@ -4440,7 +4320,7 @@
     </w:rPr>
   </w:style>
   <w:style w:type="table" w:customStyle="1" w:styleId="a">
-    <w:basedOn w:val="Tablanormal"/>
+    <w:basedOn w:val="TableNormal"/>
     <w:pPr>
       <w:spacing w:after="0" w:line="240" w:lineRule="auto"/>
     </w:pPr>
@@ -4456,7 +4336,7 @@
     </w:tblPr>
   </w:style>
   <w:style w:type="table" w:customStyle="1" w:styleId="a0">
-    <w:basedOn w:val="Tablanormal"/>
+    <w:basedOn w:val="TableNormal"/>
     <w:pPr>
       <w:spacing w:after="0" w:line="240" w:lineRule="auto"/>
     </w:pPr>
@@ -4472,7 +4352,7 @@
     </w:tblPr>
   </w:style>
   <w:style w:type="table" w:customStyle="1" w:styleId="a1">
-    <w:basedOn w:val="Tablanormal"/>
+    <w:basedOn w:val="TableNormal"/>
     <w:pPr>
       <w:spacing w:after="0" w:line="240" w:lineRule="auto"/>
     </w:pPr>
@@ -4692,28 +4572,28 @@
 </file>
 
 <file path=customXml/item1.xml><?xml version="1.0" encoding="utf-8"?>
+<b:Sources xmlns:b="http://schemas.openxmlformats.org/officeDocument/2006/bibliography" xmlns="http://schemas.openxmlformats.org/officeDocument/2006/bibliography" SelectedStyle="\APASixthEditionOfficeOnline.xsl" StyleName="APA" Version="6"/>
+</file>
+
+<file path=customXml/item2.xml><?xml version="1.0" encoding="utf-8"?>
 <go:gDocsCustomXmlDataStorage xmlns:go="http://customooxmlschemas.google.com/" xmlns:r="http://schemas.openxmlformats.org/officeDocument/2006/relationships" uri="GoogleDocsCustomDataVersion2">
   <go:docsCustomData xmlns:go="http://customooxmlschemas.google.com/" roundtripDataSignature="AMtx7mjfZHdsiCvpFOesiH+c3zMFCQ6GYw==">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</go:docsCustomData>
 </go:gDocsCustomXmlDataStorage>
 </file>
 
-<file path=customXml/item2.xml><?xml version="1.0" encoding="utf-8"?>
-<b:Sources xmlns:b="http://schemas.openxmlformats.org/officeDocument/2006/bibliography" xmlns="http://schemas.openxmlformats.org/officeDocument/2006/bibliography" SelectedStyle="\APASixthEditionOfficeOnline.xsl" StyleName="APA" Version="6"/>
+<file path=customXml/itemProps1.xml><?xml version="1.0" encoding="utf-8"?>
+<ds:datastoreItem xmlns:ds="http://schemas.openxmlformats.org/officeDocument/2006/customXml" ds:itemID="{F2C6ED9E-18BB-4E8C-9B45-9DE9ABC600F0}">
+  <ds:schemaRefs>
+    <ds:schemaRef ds:uri="http://schemas.openxmlformats.org/officeDocument/2006/bibliography"/>
+  </ds:schemaRefs>
+</ds:datastoreItem>
 </file>
 
-<file path=customXml/itemProps1.xml><?xml version="1.0" encoding="utf-8"?>
+<file path=customXml/itemProps2.xml><?xml version="1.0" encoding="utf-8"?>
 <ds:datastoreItem xmlns:ds="http://schemas.openxmlformats.org/officeDocument/2006/customXml" ds:itemID="{11111111-1234-1234-1234-123412341234}">
   <ds:schemaRefs>
     <ds:schemaRef ds:uri="http://customooxmlschemas.google.com/"/>
     <ds:schemaRef ds:uri="http://schemas.openxmlformats.org/officeDocument/2006/relationships"/>
   </ds:schemaRefs>
 </ds:datastoreItem>
-</file>
-
-<file path=customXml/itemProps2.xml><?xml version="1.0" encoding="utf-8"?>
-<ds:datastoreItem xmlns:ds="http://schemas.openxmlformats.org/officeDocument/2006/customXml" ds:itemID="{F2C6ED9E-18BB-4E8C-9B45-9DE9ABC600F0}">
-  <ds:schemaRefs>
-    <ds:schemaRef ds:uri="http://schemas.openxmlformats.org/officeDocument/2006/bibliography"/>
-  </ds:schemaRefs>
-</ds:datastoreItem>
 </file>
</xml_diff>